<commit_message>
solve the graph issue
</commit_message>
<xml_diff>
--- a/reports/final_report.docx
+++ b/reports/final_report.docx
@@ -12,7 +12,7 @@
     </w:p>
     <w:p>
       <w:r>
-        <w:t>Student: &lt;your name&gt;</w:t>
+        <w:t>Student: Alish</w:t>
       </w:r>
     </w:p>
     <w:p>
@@ -22,7 +22,7 @@
     </w:p>
     <w:p>
       <w:r>
-        <w:t>Date: June 2026</w:t>
+        <w:t>Date: July 2026</w:t>
       </w:r>
     </w:p>
     <w:p>
@@ -35,7 +35,7 @@
     </w:p>
     <w:p>
       <w:r>
-        <w:t>During this project I used AI assistance, mainly ChatGPT/Codex, for debugging, code review, report structuring, and clarification of reinforcement learning concepts. The AI helped identify implementation risks, explain the project requirements, improve the experiment runner, and draft parts of this report. The final algorithmic choices, experiment design, interpretation, and submission responsibility remain mine. AI assistance was also used to generate report wording and to organize the project into a reproducible form.</w:t>
+        <w:t>I used AI assistance, mainly ChatGPT/Codex, during this project. The assistance was used for debugging, checking the project requirements, improving the experiment runner, structuring the report, and clarifying reinforcement learning concepts. AI also helped draft and revise some report text. The implementation choices, experiment interpretation, and final responsibility for the submission remain mine. The main algorithmic components, reward designs, and conclusions were reviewed against the project instructions and the actual code/results in this repository.</w:t>
       </w:r>
     </w:p>
     <w:p>
@@ -48,7 +48,7 @@
     </w:p>
     <w:p>
       <w:r>
-        <w:t>The project satisfies the minimum requirements and includes several additions:</w:t>
+        <w:t>The minimum project requires four reward designs, SARSA, prioritized sweeping, a generalization mechanism, reward comparison, parameter sweeps, component ablations, plots, and policy visualization. This project includes those core parts and adds several extra pieces:</w:t>
       </w:r>
     </w:p>
     <w:p>
@@ -72,7 +72,15 @@
         <w:pStyle w:val="ListBullet"/>
       </w:pPr>
       <w:r>
-        <w:t xml:space="preserve">The code saves trained policies as model artifacts under </w:t>
+        <w:t>The reward comparison plot uses a normalized environment reward so different training reward scales do not distort the main comparison.</w:t>
+      </w:r>
+    </w:p>
+    <w:p>
+      <w:pPr>
+        <w:pStyle w:val="ListBullet"/>
+      </w:pPr>
+      <w:r>
+        <w:t xml:space="preserve">Trained Q-tables are saved under </w:t>
       </w:r>
       <w:r>
         <w:rPr>
@@ -82,34 +90,13 @@
         <w:t>results/models</w:t>
       </w:r>
       <w:r>
-        <w:t>.</w:t>
+        <w:t>, so policies can be visualized without retraining.</w:t>
       </w:r>
     </w:p>
     <w:p>
       <w:pPr>
         <w:pStyle w:val="ListBullet"/>
       </w:pPr>
-      <w:r>
-        <w:t xml:space="preserve">The project includes saved-policy visualization through </w:t>
-      </w:r>
-      <w:r>
-        <w:rPr>
-          <w:rFonts w:ascii="Courier New" w:hAnsi="Courier New"/>
-          <w:sz w:val="20"/>
-        </w:rPr>
-        <w:t>python main.py --visualize-saved</w:t>
-      </w:r>
-      <w:r>
-        <w:t>.</w:t>
-      </w:r>
-    </w:p>
-    <w:p>
-      <w:pPr>
-        <w:pStyle w:val="ListBullet"/>
-      </w:pPr>
-      <w:r>
-        <w:t xml:space="preserve">The project includes a step-by-step explanatory simulator in </w:t>
-      </w:r>
       <w:r>
         <w:rPr>
           <w:rFonts w:ascii="Courier New" w:hAnsi="Courier New"/>
@@ -118,7 +105,7 @@
         <w:t>explain_simulation.py</w:t>
       </w:r>
       <w:r>
-        <w:t>.</w:t>
+        <w:t xml:space="preserve"> provides a step-by-step explanation of one learned episode.</w:t>
       </w:r>
     </w:p>
     <w:p>
@@ -126,45 +113,35 @@
         <w:pStyle w:val="ListBullet"/>
       </w:pPr>
       <w:r>
-        <w:t>The experiment runner generates a limited, submission-friendly set of 8 plots.</w:t>
-      </w:r>
-    </w:p>
-    <w:p>
-      <w:r>
-        <w:t xml:space="preserve">Important note: the current code contains the updated Composite Remaining Path reward as </w:t>
+        <w:t xml:space="preserve">A </w:t>
       </w:r>
       <w:r>
         <w:rPr>
           <w:rFonts w:ascii="Courier New" w:hAnsi="Courier New"/>
           <w:sz w:val="20"/>
         </w:rPr>
-        <w:t>reward_5</w:t>
+        <w:t>--fast</w:t>
       </w:r>
       <w:r>
-        <w:t xml:space="preserve">. If results were generated before this update, the reward-comparison plots should be regenerated before final submission using </w:t>
-      </w:r>
-      <w:r>
-        <w:rPr>
-          <w:rFonts w:ascii="Courier New" w:hAnsi="Courier New"/>
-          <w:sz w:val="20"/>
-        </w:rPr>
-        <w:t>python main.py</w:t>
-      </w:r>
-      <w:r>
-        <w:t>.</w:t>
-      </w:r>
-    </w:p>
-    <w:p>
-      <w:pPr>
-        <w:pStyle w:val="Heading1"/>
-      </w:pPr>
-      <w:r>
-        <w:t>3. Environment</w:t>
+        <w:t xml:space="preserve"> mode gives a short single-seed development run.</w:t>
       </w:r>
     </w:p>
     <w:p>
       <w:r>
-        <w:t xml:space="preserve">The environment is Gymnasium Taxi-v4 using the default Taxi map. The code attempts to set </w:t>
+        <w:t>The extra reward design is discussed in Section 5.5. The normalized reward comparison is discussed in Section 9.2. The saved-policy visualization workflow is discussed in Section 8 and Section 13.</w:t>
+      </w:r>
+    </w:p>
+    <w:p>
+      <w:pPr>
+        <w:pStyle w:val="Heading1"/>
+      </w:pPr>
+      <w:r>
+        <w:t>3. Environment and Map</w:t>
+      </w:r>
+    </w:p>
+    <w:p>
+      <w:r>
+        <w:t xml:space="preserve">The project uses Gymnasium Taxi-v4 with the default Taxi map. The code attempts to create the environment with </w:t>
       </w:r>
       <w:r>
         <w:rPr>
@@ -174,80 +151,12 @@
         <w:t>is_rainy=False</w:t>
       </w:r>
       <w:r>
-        <w:t>, as required. If the installed Gymnasium version does not support this argument, the code falls back to the standard Taxi-v4 environment while preserving the same deterministic Taxi task.</w:t>
+        <w:t>, as required. If the installed Gymnasium version does not support that argument, the code falls back to the standard deterministic Taxi-v4 environment.</w:t>
       </w:r>
     </w:p>
     <w:p>
       <w:r>
-        <w:t>Taxi-v4 has:</w:t>
-      </w:r>
-    </w:p>
-    <w:p>
-      <w:pPr>
-        <w:pStyle w:val="ListBullet"/>
-      </w:pPr>
-      <w:r>
-        <w:t>500 discrete states.</w:t>
-      </w:r>
-    </w:p>
-    <w:p>
-      <w:pPr>
-        <w:pStyle w:val="ListBullet"/>
-      </w:pPr>
-      <w:r>
-        <w:t>6 actions: south, north, east, west, pickup, dropoff.</w:t>
-      </w:r>
-    </w:p>
-    <w:p>
-      <w:pPr>
-        <w:pStyle w:val="ListBullet"/>
-      </w:pPr>
-      <w:r>
-        <w:t>Passenger locations: Red, Green, Yellow, Blue, or inside the taxi.</w:t>
-      </w:r>
-    </w:p>
-    <w:p>
-      <w:pPr>
-        <w:pStyle w:val="ListBullet"/>
-      </w:pPr>
-      <w:r>
-        <w:t>Four possible destinations.</w:t>
-      </w:r>
-    </w:p>
-    <w:p>
-      <w:pPr>
-        <w:pStyle w:val="ListBullet"/>
-      </w:pPr>
-      <w:r>
-        <w:t>The standard base reward from the environment.</w:t>
-      </w:r>
-    </w:p>
-    <w:p>
-      <w:r>
-        <w:t xml:space="preserve">The state is decoded as </w:t>
-      </w:r>
-      <w:r>
-        <w:rPr>
-          <w:rFonts w:ascii="Courier New" w:hAnsi="Courier New"/>
-          <w:sz w:val="20"/>
-        </w:rPr>
-        <w:t>(taxi_row, taxi_col, passenger_location, destination)</w:t>
-      </w:r>
-      <w:r>
-        <w:t>. This representation is used both by the reward functions and by the kernel-based generalization mechanism.</w:t>
-      </w:r>
-    </w:p>
-    <w:p>
-      <w:pPr>
-        <w:pStyle w:val="Heading1"/>
-      </w:pPr>
-      <w:r>
-        <w:t>4. Algorithm</w:t>
-      </w:r>
-    </w:p>
-    <w:p>
-      <w:r>
-        <w:t>The base algorithm is tabular SARSA with epsilon-greedy action selection. The update rule is:</w:t>
+        <w:t>Taxi-v4 has 500 discrete states and 6 actions: south, north, east, west, pickup, and dropoff. The state is decoded as:</w:t>
       </w:r>
     </w:p>
     <w:p>
@@ -259,7 +168,25 @@
           <w:rFonts w:ascii="Courier New" w:hAnsi="Courier New"/>
           <w:sz w:val="18"/>
         </w:rPr>
-        <w:t>Q(s_t, a_t) &lt;- Q(s_t, a_t) + alpha * delta_t</w:t>
+        <w:t>(taxi_row, taxi_col, passenger_location, destination)</w:t>
+      </w:r>
+    </w:p>
+    <w:p>
+      <w:r>
+        <w:t>The passenger can be at one of four landmarks or inside the taxi. The destination is one of the same four landmarks. This representation is used by the custom rewards and by the kernel generalization mechanism.</w:t>
+      </w:r>
+    </w:p>
+    <w:p>
+      <w:pPr>
+        <w:pStyle w:val="Heading1"/>
+      </w:pPr>
+      <w:r>
+        <w:t>4. Algorithm Specification</w:t>
+      </w:r>
+    </w:p>
+    <w:p>
+      <w:r>
+        <w:t>The base learner is tabular SARSA with epsilon-greedy action selection. The SARSA update is:</w:t>
       </w:r>
     </w:p>
     <w:p>
@@ -271,7 +198,7 @@
           <w:rFonts w:ascii="Courier New" w:hAnsi="Courier New"/>
           <w:sz w:val="18"/>
         </w:rPr>
-        <w:t xml:space="preserve"> </w:t>
+        <w:t>Q(s, a) &lt;- Q(s, a) + alpha * delta</w:t>
       </w:r>
     </w:p>
     <w:p>
@@ -283,12 +210,12 @@
           <w:rFonts w:ascii="Courier New" w:hAnsi="Courier New"/>
           <w:sz w:val="18"/>
         </w:rPr>
-        <w:t>delta_t = r_{t+1} + gamma * Q(s_{t+1}, a_{t+1}) - Q(s_t, a_t)</w:t>
+        <w:t>delta = r + gamma * Q(s_next, a_next) - Q(s, a)</w:t>
       </w:r>
     </w:p>
     <w:p>
       <w:r>
-        <w:t xml:space="preserve">The agent is implemented in one class, </w:t>
+        <w:t xml:space="preserve">The implementation uses one agent class, </w:t>
       </w:r>
       <w:r>
         <w:rPr>
@@ -298,25 +225,12 @@
         <w:t>GeneralizedSweepingSARSAAgent</w:t>
       </w:r>
       <w:r>
-        <w:t>, with flags for enabling or disabling prioritized sweeping and kernel generalization. This supports the required component ablations without duplicating agent classes.</w:t>
-      </w:r>
-    </w:p>
-    <w:p>
-      <w:pPr>
-        <w:pStyle w:val="Heading2"/>
-      </w:pPr>
-      <w:r>
-        <w:t>4.1 Action Selection and Exploration</w:t>
+        <w:t>, with flags for prioritized sweeping and kernel generalization. This keeps the ablations consistent because the same code path is used with components switched on or off.</w:t>
       </w:r>
     </w:p>
     <w:p>
       <w:r>
-        <w:t>The agent uses epsilon-greedy action selection. When several actions share the best Q-value, the implementation breaks ties randomly. This is important early in learning, because all Q-values begin at zero. Without random tie-breaking, the agent could repeatedly prefer the first action and explore less effectively.</w:t>
-      </w:r>
-    </w:p>
-    <w:p>
-      <w:r>
-        <w:t>Epsilon starts high and decays over time. The decay is computed dynamically:</w:t>
+        <w:t>Main hyperparameters in the full framework:</w:t>
       </w:r>
     </w:p>
     <w:p>
@@ -328,25 +242,7 @@
           <w:rFonts w:ascii="Courier New" w:hAnsi="Courier New"/>
           <w:sz w:val="18"/>
         </w:rPr>
-        <w:t>epsilon_decay = 0.05 ** (1.0 / (0.6 * num_episodes))</w:t>
-      </w:r>
-    </w:p>
-    <w:p>
-      <w:r>
-        <w:t>This means epsilon reaches approximately 0.05 after 60% of the training horizon, regardless of whether the run uses 300, 400, or 600 episodes.</w:t>
-      </w:r>
-    </w:p>
-    <w:p>
-      <w:pPr>
-        <w:pStyle w:val="Heading2"/>
-      </w:pPr>
-      <w:r>
-        <w:t>4.2 Prioritized Sweeping</w:t>
-      </w:r>
-    </w:p>
-    <w:p>
-      <w:r>
-        <w:t>The agent stores observed transitions in an internal model:</w:t>
+        <w:t>alpha = 0.5</w:t>
       </w:r>
     </w:p>
     <w:p>
@@ -358,30 +254,156 @@
           <w:rFonts w:ascii="Courier New" w:hAnsi="Courier New"/>
           <w:sz w:val="18"/>
         </w:rPr>
-        <w:t>M(s, a) = (r, s', done)</w:t>
+        <w:t>gamma = 0.99</w:t>
+      </w:r>
+    </w:p>
+    <w:p>
+      <w:pPr>
+        <w:pStyle w:val="CodeBlock"/>
+      </w:pPr>
+      <w:r>
+        <w:rPr>
+          <w:rFonts w:ascii="Courier New" w:hAnsi="Courier New"/>
+          <w:sz w:val="18"/>
+        </w:rPr>
+        <w:t>epsilon starts at 0.3</w:t>
+      </w:r>
+    </w:p>
+    <w:p>
+      <w:pPr>
+        <w:pStyle w:val="CodeBlock"/>
+      </w:pPr>
+      <w:r>
+        <w:rPr>
+          <w:rFonts w:ascii="Courier New" w:hAnsi="Courier New"/>
+          <w:sz w:val="18"/>
+        </w:rPr>
+        <w:t>epsilon_min = 0.01</w:t>
+      </w:r>
+    </w:p>
+    <w:p>
+      <w:pPr>
+        <w:pStyle w:val="CodeBlock"/>
+      </w:pPr>
+      <w:r>
+        <w:rPr>
+          <w:rFonts w:ascii="Courier New" w:hAnsi="Courier New"/>
+          <w:sz w:val="18"/>
+        </w:rPr>
+        <w:t>planning_steps n = 5</w:t>
+      </w:r>
+    </w:p>
+    <w:p>
+      <w:pPr>
+        <w:pStyle w:val="CodeBlock"/>
+      </w:pPr>
+      <w:r>
+        <w:rPr>
+          <w:rFonts w:ascii="Courier New" w:hAnsi="Courier New"/>
+          <w:sz w:val="18"/>
+        </w:rPr>
+        <w:t>theta = 1e-4</w:t>
+      </w:r>
+    </w:p>
+    <w:p>
+      <w:pPr>
+        <w:pStyle w:val="CodeBlock"/>
+      </w:pPr>
+      <w:r>
+        <w:rPr>
+          <w:rFonts w:ascii="Courier New" w:hAnsi="Courier New"/>
+          <w:sz w:val="18"/>
+        </w:rPr>
+        <w:t>beta = 4.0</w:t>
+      </w:r>
+    </w:p>
+    <w:p>
+      <w:pPr>
+        <w:pStyle w:val="CodeBlock"/>
+      </w:pPr>
+      <w:r>
+        <w:rPr>
+          <w:rFonts w:ascii="Courier New" w:hAnsi="Courier New"/>
+          <w:sz w:val="18"/>
+        </w:rPr>
+        <w:t>c = 0.5</w:t>
+      </w:r>
+    </w:p>
+    <w:p>
+      <w:pPr>
+        <w:pStyle w:val="CodeBlock"/>
+      </w:pPr>
+      <w:r>
+        <w:rPr>
+          <w:rFonts w:ascii="Courier New" w:hAnsi="Courier New"/>
+          <w:sz w:val="18"/>
+        </w:rPr>
+        <w:t>max_kernel_neighbors = 4</w:t>
+      </w:r>
+    </w:p>
+    <w:p>
+      <w:pPr>
+        <w:pStyle w:val="CodeBlock"/>
+      </w:pPr>
+      <w:r>
+        <w:rPr>
+          <w:rFonts w:ascii="Courier New" w:hAnsi="Courier New"/>
+          <w:sz w:val="18"/>
+        </w:rPr>
+        <w:t>kernel_scale = 0.5</w:t>
       </w:r>
     </w:p>
     <w:p>
       <w:r>
-        <w:t>After a real SARSA update, the magnitude of the TD error is used as a priority. High-priority state-action pairs are inserted into a priority queue. During planning, the agent repeatedly pops high-priority transitions and applies SARSA-style updates from the learned model.</w:t>
+        <w:t>Epsilon decays over training. The decay is selected so exploration becomes much smaller after a substantial part of training, while still leaving a small amount of random action selection.</w:t>
+      </w:r>
+    </w:p>
+    <w:p>
+      <w:pPr>
+        <w:pStyle w:val="Heading2"/>
+      </w:pPr>
+      <w:r>
+        <w:t>4.1 Prioritized Sweeping</w:t>
       </w:r>
     </w:p>
     <w:p>
       <w:r>
-        <w:t>Unlike simple Dyna-Q, this implementation does not sample model transitions uniformly. It uses prioritized sweeping, so larger TD errors receive planning attention earlier. The planning update also uses an epsilon-greedy next action, preserving the SARSA-style update required by the project.</w:t>
+        <w:t>After each real SARSA update, the agent stores the observed transition in an internal model:</w:t>
       </w:r>
     </w:p>
     <w:p>
       <w:pPr>
-        <w:pStyle w:val="Heading2"/>
+        <w:pStyle w:val="CodeBlock"/>
       </w:pPr>
       <w:r>
-        <w:t>4.3 Kernel Generalization</w:t>
+        <w:rPr>
+          <w:rFonts w:ascii="Courier New" w:hAnsi="Courier New"/>
+          <w:sz w:val="18"/>
+        </w:rPr>
+        <w:t>M(s, a) = (r, s_next, done)</w:t>
       </w:r>
     </w:p>
     <w:p>
       <w:r>
-        <w:t>The generalization mechanism updates similar state-action pairs after an observed transition. The kernel is:</w:t>
+        <w:t>The absolute TD error is used as the priority. High-priority state-action pairs are pushed into a priority queue. During planning, the agent pops high-priority transitions and performs SARSA-style model updates. The next action during planning is selected with the same epsilon-greedy action rule, which keeps the update on-policy in the SARSA sense.</w:t>
+      </w:r>
+    </w:p>
+    <w:p>
+      <w:r>
+        <w:t>This is not simple Dyna-Q. Simple Dyna-Q would sample previously observed transitions more uniformly. Here, transitions with larger estimated learning impact receive planning attention first.</w:t>
+      </w:r>
+    </w:p>
+    <w:p>
+      <w:pPr>
+        <w:pStyle w:val="Heading2"/>
+      </w:pPr>
+      <w:r>
+        <w:t>4.2 Kernel Generalization</w:t>
+      </w:r>
+    </w:p>
+    <w:p>
+      <w:r>
+        <w:t>The generalization mechanism updates nearby, semantically compatible state-action pairs after a real transition. The kernel is:</w:t>
       </w:r>
     </w:p>
     <w:p>
@@ -398,7 +420,7 @@
     </w:p>
     <w:p>
       <w:r>
-        <w:t xml:space="preserve">where </w:t>
+        <w:t xml:space="preserve">Here, </w:t>
       </w:r>
       <w:r>
         <w:rPr>
@@ -408,7 +430,12 @@
         <w:t>d</w:t>
       </w:r>
       <w:r>
-        <w:t xml:space="preserve"> is the Manhattan distance between taxi positions. The implementation uses:</w:t>
+        <w:t xml:space="preserve"> is the Manhattan distance between taxi positions. The kernel is symmetric because the Manhattan distance is symmetric. Two Taxi states are considered candidates for generalization only when they have the same passenger status/location and the same destination. This is important because two nearby taxi positions can belong to completely different subtasks if the passenger or destination differs.</w:t>
+      </w:r>
+    </w:p>
+    <w:p>
+      <w:r>
+        <w:t>The kernel update uses the neighbor's own stored transition:</w:t>
       </w:r>
     </w:p>
     <w:p>
@@ -420,7 +447,7 @@
           <w:rFonts w:ascii="Courier New" w:hAnsi="Courier New"/>
           <w:sz w:val="18"/>
         </w:rPr>
-        <w:t>beta = 4.0</w:t>
+        <w:t>delta_hat = r_hat + gamma * Q(s_hat_next, a_hat_next) - Q(s_hat, a)</w:t>
       </w:r>
     </w:p>
     <w:p>
@@ -432,94 +459,12 @@
           <w:rFonts w:ascii="Courier New" w:hAnsi="Courier New"/>
           <w:sz w:val="18"/>
         </w:rPr>
-        <w:t>c = 0.5</w:t>
-      </w:r>
-    </w:p>
-    <w:p>
-      <w:pPr>
-        <w:pStyle w:val="CodeBlock"/>
-      </w:pPr>
-      <w:r>
-        <w:rPr>
-          <w:rFonts w:ascii="Courier New" w:hAnsi="Courier New"/>
-          <w:sz w:val="18"/>
-        </w:rPr>
-        <w:t>max_kernel_neighbors = 4</w:t>
-      </w:r>
-    </w:p>
-    <w:p>
-      <w:pPr>
-        <w:pStyle w:val="CodeBlock"/>
-      </w:pPr>
-      <w:r>
-        <w:rPr>
-          <w:rFonts w:ascii="Courier New" w:hAnsi="Courier New"/>
-          <w:sz w:val="18"/>
-        </w:rPr>
-        <w:t>kernel_scale = 0.5</w:t>
+        <w:t>Q(s_hat, a) &lt;- Q(s_hat, a) + alpha * K(s, s_hat) * delta_hat</w:t>
       </w:r>
     </w:p>
     <w:p>
       <w:r>
-        <w:t>Two states are considered kernel-neighbors only if they share the same passenger status/location and the same destination. This follows the project warning that nearby taxi positions may represent different subtasks if the passenger or destination differs.</w:t>
-      </w:r>
-    </w:p>
-    <w:p>
-      <w:r>
-        <w:t>For runtime control, only the closest kernel neighbors are used. This keeps training practical while still allowing value updates to spread locally across the grid.</w:t>
-      </w:r>
-    </w:p>
-    <w:p>
-      <w:r>
-        <w:t>The implementation computes each neighbor's own TD error from its own stored model transition:</w:t>
-      </w:r>
-    </w:p>
-    <w:p>
-      <w:pPr>
-        <w:pStyle w:val="CodeBlock"/>
-      </w:pPr>
-      <w:r>
-        <w:rPr>
-          <w:rFonts w:ascii="Courier New" w:hAnsi="Courier New"/>
-          <w:sz w:val="18"/>
-        </w:rPr>
-        <w:t>delta_hat = r_hat + gamma * Q(s_hat', a_hat') - Q(s_hat, a)</w:t>
-      </w:r>
-    </w:p>
-    <w:p>
-      <w:r>
-        <w:t>This matches the mathematical requirement that generalized updates should use the neighbor trajectory rather than reusing the original TD error.</w:t>
-      </w:r>
-    </w:p>
-    <w:p>
-      <w:pPr>
-        <w:pStyle w:val="Heading2"/>
-      </w:pPr>
-      <w:r>
-        <w:t>4.4 Design Choice: Kernel on Movement Actions</w:t>
-      </w:r>
-    </w:p>
-    <w:p>
-      <w:r>
-        <w:t>Kernel generalization is applied only to movement actions: south, north, east, and west. It is not applied to pickup or dropoff actions.</w:t>
-      </w:r>
-    </w:p>
-    <w:p>
-      <w:r>
-        <w:t>The reason is semantic consistency. Moving east in two nearby taxi states has a similar meaning if passenger status and destination match. Pickup and dropoff are different: their legality and effect depend sharply on being exactly at the passenger or destination location. Generalizing pickup/dropoff across nearby states could spread invalid action values into states where the action is illegal. Therefore, the kernel is restricted to movement actions.</w:t>
-      </w:r>
-    </w:p>
-    <w:p>
-      <w:pPr>
-        <w:pStyle w:val="Heading2"/>
-      </w:pPr>
-      <w:r>
-        <w:t>4.5 Design Choice: Kernel Outside Planning</w:t>
-      </w:r>
-    </w:p>
-    <w:p>
-      <w:r>
-        <w:t>In the current configuration, the full framework uses SARSA, prioritized sweeping, and kernel updates after real observed transitions. Kernel updates are not applied inside each planning step by default. This was chosen to reduce runtime and avoid repeated local propagation from simulated transitions. The resulting full setting still compares all three components: online SARSA learning, model-based prioritized planning, and local value generalization.</w:t>
+        <w:t>The implementation applies kernel generalization only to movement actions. Pickup and dropoff are not generalized because their validity depends on exact location. This avoids spreading illegal pickup/dropoff values into nearby but invalid states.</w:t>
       </w:r>
     </w:p>
     <w:p>
@@ -532,7 +477,7 @@
     </w:p>
     <w:p>
       <w:r>
-        <w:t>Five rewards are implemented. Rewards 3, 4, and 5 are custom designs.</w:t>
+        <w:t>The project implements five rewards. The first two are required baselines, rewards 3 and 4 are custom required rewards, and reward 5 is an extra custom reward.</w:t>
       </w:r>
     </w:p>
     <w:p>
@@ -545,7 +490,7 @@
     </w:p>
     <w:p>
       <w:r>
-        <w:t>This reward uses the Taxi-v4 reward directly:</w:t>
+        <w:t>The base reward is the reward returned by Taxi-v4:</w:t>
       </w:r>
     </w:p>
     <w:p>
@@ -562,7 +507,7 @@
     </w:p>
     <w:p>
       <w:r>
-        <w:t>It is the natural baseline and preserves the original MDP.</w:t>
+        <w:t>This reward preserves the original environment objective. It is the most direct way to measure whether the agent is solving the task according to Taxi's native scoring.</w:t>
       </w:r>
     </w:p>
     <w:p>
@@ -575,7 +520,7 @@
     </w:p>
     <w:p>
       <w:r>
-        <w:t>The sparse reward ignores most feedback and rewards only successful completion:</w:t>
+        <w:t>Sparse reward ignores most feedback:</w:t>
       </w:r>
     </w:p>
     <w:p>
@@ -604,7 +549,7 @@
     </w:p>
     <w:p>
       <w:r>
-        <w:t>This reward tests how difficult learning becomes when the agent receives almost no intermediate guidance.</w:t>
+        <w:t>This design is conceptually clean but difficult for learning. Most transitions provide no useful signal, so the agent must discover the full pickup-and-dropoff sequence before it receives meaningful feedback.</w:t>
       </w:r>
     </w:p>
     <w:p>
@@ -617,7 +562,7 @@
     </w:p>
     <w:p>
       <w:r>
-        <w:t>Reward 3 gives dense feedback for moving toward the current subgoal. Before pickup, the current target is the passenger. After pickup, the current target is the destination.</w:t>
+        <w:t>Reward 3 gives immediate feedback for moving toward the current subgoal. Before pickup, the target is the passenger. After pickup, the target is the destination.</w:t>
       </w:r>
     </w:p>
     <w:p>
@@ -629,7 +574,7 @@
           <w:rFonts w:ascii="Courier New" w:hAnsi="Courier New"/>
           <w:sz w:val="18"/>
         </w:rPr>
-        <w:t>progress = old_distance_to_current_target - new_distance_to_current_target</w:t>
+        <w:t>progress = old_distance_to_target - new_distance_to_target</w:t>
       </w:r>
     </w:p>
     <w:p>
@@ -706,7 +651,7 @@
     </w:p>
     <w:p>
       <w:r>
-        <w:t>The intuition is that the agent should receive immediate feedback when it moves in a useful direction. This makes learning easier than sparse reward because useful navigation behavior is reinforced before the final dropoff.</w:t>
+        <w:t>The intuition is that navigation should be reinforced before the final dropoff. This can reduce the exploration burden compared with sparse reward because the agent receives a signal even before completing the full task.</w:t>
       </w:r>
     </w:p>
     <w:p>
@@ -719,7 +664,7 @@
     </w:p>
     <w:p>
       <w:r>
-        <w:t>Reward 4 emphasizes safe task completion. It uses a small time penalty, strong subgoal rewards, and explicit penalties for illegal or unproductive behavior.</w:t>
+        <w:t>Reward 4 emphasizes safe task completion:</w:t>
       </w:r>
     </w:p>
     <w:p>
@@ -796,7 +741,7 @@
     </w:p>
     <w:p>
       <w:r>
-        <w:t>This reward is designed to strongly discourage illegal actions while still maintaining pressure to finish the task quickly. It is especially useful in Taxi because pickup and dropoff actions can easily be attempted in invalid states.</w:t>
+        <w:t>This reward is designed to strongly discourage illegal pickup/dropoff actions and wall bumps while still rewarding the two meaningful subgoals: pickup and final dropoff. It should help when illegal actions are the main failure mode, but the stronger penalties can also make learning more sensitive to alpha and planning depth.</w:t>
       </w:r>
     </w:p>
     <w:p>
@@ -809,12 +754,7 @@
     </w:p>
     <w:p>
       <w:r>
-        <w:t>Reward 5 is the most global custom reward. Instead of measuring only progress toward the immediate target, it measures progress in the estimated total remaining task path.</w:t>
-      </w:r>
-    </w:p>
-    <w:p>
-      <w:r>
-        <w:t>If the passenger has not yet been picked up:</w:t>
+        <w:t>Reward 5 measures whether the estimated full remaining task becomes shorter. If the passenger is not inside the taxi:</w:t>
       </w:r>
     </w:p>
     <w:p>
@@ -901,12 +841,7 @@
     </w:p>
     <w:p>
       <w:r>
-        <w:t>This is a complete reward replacement rather than base reward plus shaping. Its purpose is to give the agent a global signal about whether the whole remaining task is getting shorter. It is more task-aware than a purely local distance reward.</w:t>
-      </w:r>
-    </w:p>
-    <w:p>
-      <w:r>
-        <w:t>One limitation is that the reward uses Manhattan distance, while Taxi has walls. Therefore, the distance is a heuristic estimate of remaining effort rather than an exact shortest-path distance. Even with that limitation, it provides a useful learning signal because it aligns broadly with the structure of the task.</w:t>
+        <w:t>This reward is a full replacement reward, not base reward plus shaping. It gives a task-level signal: the agent is rewarded when the whole remaining route is estimated to become shorter. A limitation is that Manhattan distance ignores Taxi walls, so the distance is a heuristic rather than an exact shortest path.</w:t>
       </w:r>
     </w:p>
     <w:p>
@@ -919,58 +854,22 @@
     </w:p>
     <w:p>
       <w:r>
-        <w:t>The strongest overall lesson from this project is that reward design, planning, and exploration interact strongly.</w:t>
+        <w:t>The main finding is that reward design, planning, and generalization interact strongly. The best reward is not simply the one with the largest internal training reward scale. For comparison across reward designs, the fairest metrics are environment reward, normalized environment reward, success rate, and illegal-action count.</w:t>
       </w:r>
     </w:p>
     <w:p>
       <w:r>
-        <w:t>Sparse reward is conceptually clean but difficult for the agent, because most episodes provide no useful learning signal until the final dropoff. Dense custom rewards improve learning by providing feedback during navigation, pickup, and dropoff. Reward 4 is expected to be especially stable because it explicitly penalizes illegal actions and wall bumps while rewarding subgoals. Reward 5 is more global and should be interesting to compare because it rewards shortening the whole remaining task, not only the current navigation leg.</w:t>
+        <w:t>In the latest reward comparison, Base Environment Reward and Composite Remaining Path Reward reached strong final performance. Over the last 50 episodes per seed, both reached 100% success in the saved results, with near-perfect normalized environment reward. Sparse Reward also improved, but it retained many illegal actions and lower environment reward because the agent receives little guidance before success. Reward 3 and Reward 4 were more difficult under the shared full-framework hyperparameters. This does not mean the reward ideas are useless; it means their scales and penalties interact with alpha, planning, and exploration.</w:t>
       </w:r>
     </w:p>
     <w:p>
       <w:r>
-        <w:t>Prioritized sweeping helps because it reuses important observed transitions. In Taxi, many states share local structure, so planning can improve sample efficiency. Kernel generalization further spreads information across nearby taxi positions that share the same passenger status and destination. The kernel is helpful when the nearby states truly represent the same subtask, but it must be limited carefully to avoid spreading values across semantically different states.</w:t>
+        <w:t>The ablation results show that all base-reward setups eventually reached high success, but their final environment reward and illegal-action behavior differed. Kernel generalization alone was particularly strong in the final tail. Prioritized sweeping is useful, but with imperfect early values it can also replay and amplify early estimates. The full framework remains important because it combines real SARSA updates, model-based replay, and local value propagation, but it requires careful hyperparameter selection.</w:t>
       </w:r>
     </w:p>
     <w:p>
       <w:r>
-        <w:t>The current full run uses 5 seeds and 600 episodes. A full run observed during development took about 41.67 minutes on the local machine. This is longer than initially expected because the experiment still trains many separate agents:</w:t>
-      </w:r>
-    </w:p>
-    <w:p>
-      <w:pPr>
-        <w:pStyle w:val="CodeBlock"/>
-      </w:pPr>
-      <w:r>
-        <w:rPr>
-          <w:rFonts w:ascii="Courier New" w:hAnsi="Courier New"/>
-          <w:sz w:val="18"/>
-        </w:rPr>
-        <w:t>Ablation:          8 configs * 5 seeds * 600 episodes</w:t>
-      </w:r>
-    </w:p>
-    <w:p>
-      <w:pPr>
-        <w:pStyle w:val="CodeBlock"/>
-      </w:pPr>
-      <w:r>
-        <w:rPr>
-          <w:rFonts w:ascii="Courier New" w:hAnsi="Courier New"/>
-          <w:sz w:val="18"/>
-        </w:rPr>
-        <w:t>Reward comparison: 5 rewards * 5 seeds * 600 episodes</w:t>
-      </w:r>
-    </w:p>
-    <w:p>
-      <w:pPr>
-        <w:pStyle w:val="CodeBlock"/>
-      </w:pPr>
-      <w:r>
-        <w:rPr>
-          <w:rFonts w:ascii="Courier New" w:hAnsi="Courier New"/>
-          <w:sz w:val="18"/>
-        </w:rPr>
-        <w:t>Parameter sweep:   2 rewards * 2 alpha values * 2 planning values * 5 seeds * 400 episodes</w:t>
+        <w:t>The parameter sweep supports this interpretation. For the base reward, alpha = 0.8 and n = 10 produced the best final environment reward among the tested sweep settings. For Reward 4, alpha = 0.8 was much better than alpha = 0.2, while increasing planning from n = 2 to n = 10 did not improve the final score. This suggests that the designed safety reward needs stronger learning updates, but too much planning can amplify noisy penalty-heavy estimates.</w:t>
       </w:r>
     </w:p>
     <w:p>
@@ -983,7 +882,7 @@
     </w:p>
     <w:p>
       <w:r>
-        <w:t>The default full experiment uses:</w:t>
+        <w:t>The latest available result files use:</w:t>
       </w:r>
     </w:p>
     <w:p>
@@ -1019,7 +918,7 @@
           <w:rFonts w:ascii="Courier New" w:hAnsi="Courier New"/>
           <w:sz w:val="18"/>
         </w:rPr>
-        <w:t>Training episodes: 600</w:t>
+        <w:t>Reward comparison episodes: 500</w:t>
       </w:r>
     </w:p>
     <w:p>
@@ -1031,7 +930,7 @@
           <w:rFonts w:ascii="Courier New" w:hAnsi="Courier New"/>
           <w:sz w:val="18"/>
         </w:rPr>
-        <w:t>Sweep episodes: 400</w:t>
+        <w:t>Component ablation episodes: 500</w:t>
       </w:r>
     </w:p>
     <w:p>
@@ -1043,19 +942,7 @@
           <w:rFonts w:ascii="Courier New" w:hAnsi="Courier New"/>
           <w:sz w:val="18"/>
         </w:rPr>
-        <w:t>Gamma: 0.99</w:t>
-      </w:r>
-    </w:p>
-    <w:p>
-      <w:pPr>
-        <w:pStyle w:val="CodeBlock"/>
-      </w:pPr>
-      <w:r>
-        <w:rPr>
-          <w:rFonts w:ascii="Courier New" w:hAnsi="Courier New"/>
-          <w:sz w:val="18"/>
-        </w:rPr>
-        <w:t>Default planning steps: 5</w:t>
+        <w:t>Parameter sweep episodes: 400</w:t>
       </w:r>
     </w:p>
     <w:p>
@@ -1084,73 +971,7 @@
     </w:p>
     <w:p>
       <w:r>
-        <w:t>The selected metrics are:</w:t>
-      </w:r>
-    </w:p>
-    <w:p>
-      <w:pPr>
-        <w:pStyle w:val="ListBullet"/>
-      </w:pPr>
-      <w:r>
-        <w:t>Environment reward.</w:t>
-      </w:r>
-    </w:p>
-    <w:p>
-      <w:pPr>
-        <w:pStyle w:val="ListBullet"/>
-      </w:pPr>
-      <w:r>
-        <w:t>Success rate.</w:t>
-      </w:r>
-    </w:p>
-    <w:p>
-      <w:pPr>
-        <w:pStyle w:val="ListBullet"/>
-      </w:pPr>
-      <w:r>
-        <w:t>Illegal pickup/dropoff actions.</w:t>
-      </w:r>
-    </w:p>
-    <w:p>
-      <w:r>
-        <w:t>These metrics were selected because together they answer the most important questions:</w:t>
-      </w:r>
-    </w:p>
-    <w:p>
-      <w:pPr>
-        <w:pStyle w:val="ListBullet"/>
-      </w:pPr>
-      <w:r>
-        <w:t>Is the agent improving according to the real environment?</w:t>
-      </w:r>
-    </w:p>
-    <w:p>
-      <w:pPr>
-        <w:pStyle w:val="ListBullet"/>
-      </w:pPr>
-      <w:r>
-        <w:t>Is the agent actually completing the task?</w:t>
-      </w:r>
-    </w:p>
-    <w:p>
-      <w:pPr>
-        <w:pStyle w:val="ListBullet"/>
-      </w:pPr>
-      <w:r>
-        <w:t>Is the agent learning to avoid invalid Taxi actions?</w:t>
-      </w:r>
-    </w:p>
-    <w:p>
-      <w:pPr>
-        <w:pStyle w:val="Heading2"/>
-      </w:pPr>
-      <w:r>
-        <w:t>7.1 Component Ablation</w:t>
-      </w:r>
-    </w:p>
-    <w:p>
-      <w:r>
-        <w:t>The component ablation compares four agent setups:</w:t>
+        <w:t>The reward comparison trains the full framework on all five rewards. The component ablation compares four setups under the base reward:</w:t>
       </w:r>
     </w:p>
     <w:p>
@@ -1187,140 +1008,7 @@
     </w:p>
     <w:p>
       <w:r>
-        <w:t>This is run on:</w:t>
-      </w:r>
-    </w:p>
-    <w:p>
-      <w:pPr>
-        <w:pStyle w:val="ListBullet"/>
-      </w:pPr>
-      <w:r>
-        <w:t>Base environment reward.</w:t>
-      </w:r>
-    </w:p>
-    <w:p>
-      <w:pPr>
-        <w:pStyle w:val="ListBullet"/>
-      </w:pPr>
-      <w:r>
-        <w:t>Reward 4, the custom Subgoal Safety reward.</w:t>
-      </w:r>
-    </w:p>
-    <w:p>
-      <w:r>
-        <w:t>This produces the required comparison with and without planning and with and without kernel use.</w:t>
-      </w:r>
-    </w:p>
-    <w:p>
-      <w:pPr>
-        <w:pStyle w:val="Heading2"/>
-      </w:pPr>
-      <w:r>
-        <w:t>7.2 Reward Comparison</w:t>
-      </w:r>
-    </w:p>
-    <w:p>
-      <w:r>
-        <w:t>The reward comparison trains the full framework with all reward designs:</w:t>
-      </w:r>
-    </w:p>
-    <w:p>
-      <w:pPr>
-        <w:pStyle w:val="ListBullet"/>
-      </w:pPr>
-      <w:r>
-        <w:t>Base Environment Reward.</w:t>
-      </w:r>
-    </w:p>
-    <w:p>
-      <w:pPr>
-        <w:pStyle w:val="ListBullet"/>
-      </w:pPr>
-      <w:r>
-        <w:t>Sparse Reward.</w:t>
-      </w:r>
-    </w:p>
-    <w:p>
-      <w:pPr>
-        <w:pStyle w:val="ListBullet"/>
-      </w:pPr>
-      <w:r>
-        <w:t>Dense Target Progress Reward.</w:t>
-      </w:r>
-    </w:p>
-    <w:p>
-      <w:pPr>
-        <w:pStyle w:val="ListBullet"/>
-      </w:pPr>
-      <w:r>
-        <w:t>Subgoal Safety Reward.</w:t>
-      </w:r>
-    </w:p>
-    <w:p>
-      <w:pPr>
-        <w:pStyle w:val="ListBullet"/>
-      </w:pPr>
-      <w:r>
-        <w:t>Composite Remaining Path Reward.</w:t>
-      </w:r>
-    </w:p>
-    <w:p>
-      <w:r>
-        <w:t>The goal is to compare how reward design changes learning behavior and final policy quality.</w:t>
-      </w:r>
-    </w:p>
-    <w:p>
-      <w:pPr>
-        <w:pStyle w:val="Heading2"/>
-      </w:pPr>
-      <w:r>
-        <w:t>7.3 Parameter Sweep</w:t>
-      </w:r>
-    </w:p>
-    <w:p>
-      <w:r>
-        <w:t>The parameter sweep compares two parameters:</w:t>
-      </w:r>
-    </w:p>
-    <w:p>
-      <w:pPr>
-        <w:pStyle w:val="ListBullet"/>
-      </w:pPr>
-      <w:r>
-        <w:t xml:space="preserve">Learning rate </w:t>
-      </w:r>
-      <w:r>
-        <w:rPr>
-          <w:rFonts w:ascii="Courier New" w:hAnsi="Courier New"/>
-          <w:sz w:val="20"/>
-        </w:rPr>
-        <w:t>alpha</w:t>
-      </w:r>
-      <w:r>
-        <w:t>.</w:t>
-      </w:r>
-    </w:p>
-    <w:p>
-      <w:pPr>
-        <w:pStyle w:val="ListBullet"/>
-      </w:pPr>
-      <w:r>
-        <w:t xml:space="preserve">Number of planning steps </w:t>
-      </w:r>
-      <w:r>
-        <w:rPr>
-          <w:rFonts w:ascii="Courier New" w:hAnsi="Courier New"/>
-          <w:sz w:val="20"/>
-        </w:rPr>
-        <w:t>n</w:t>
-      </w:r>
-      <w:r>
-        <w:t>.</w:t>
-      </w:r>
-    </w:p>
-    <w:p>
-      <w:r>
-        <w:t>The current sweep is intentionally compact:</w:t>
+        <w:t>The parameter sweep evaluates two parameters:</w:t>
       </w:r>
     </w:p>
     <w:p>
@@ -1344,395 +1032,70 @@
           <w:rFonts w:ascii="Courier New" w:hAnsi="Courier New"/>
           <w:sz w:val="18"/>
         </w:rPr>
-        <w:t>planning_steps in {2, 10}</w:t>
+        <w:t>planning_steps n in {2, 10}</w:t>
       </w:r>
     </w:p>
     <w:p>
       <w:r>
-        <w:t>It is run on:</w:t>
-      </w:r>
-    </w:p>
-    <w:p>
-      <w:pPr>
-        <w:pStyle w:val="ListBullet"/>
-      </w:pPr>
-      <w:r>
-        <w:t>Base environment reward.</w:t>
-      </w:r>
-    </w:p>
-    <w:p>
-      <w:pPr>
-        <w:pStyle w:val="ListBullet"/>
-      </w:pPr>
-      <w:r>
-        <w:t>Reward 4.</w:t>
+        <w:t>The sweep is run for Base Environment Reward and Reward 4, so both the base reward and a custom designed reward are evaluated in the sweep section.</w:t>
       </w:r>
     </w:p>
     <w:p>
       <w:r>
-        <w:t>The compact sweep was chosen because runtime became a practical constraint. It still satisfies the requirement of sweeping two parameters, while keeping the project runnable in a reasonable amount of time.</w:t>
+        <w:t>The main metrics are:</w:t>
       </w:r>
     </w:p>
     <w:p>
       <w:pPr>
+        <w:pStyle w:val="ListBullet"/>
+      </w:pPr>
+      <w:r>
+        <w:t>Environment reward: Taxi-v4's original reward accumulated over an episode.</w:t>
+      </w:r>
+    </w:p>
+    <w:p>
+      <w:pPr>
+        <w:pStyle w:val="ListBullet"/>
+      </w:pPr>
+      <w:r>
+        <w:t>Normalized environment reward: environment reward scaled relative to the optimal reward for the episode's start state.</w:t>
+      </w:r>
+    </w:p>
+    <w:p>
+      <w:pPr>
+        <w:pStyle w:val="ListBullet"/>
+      </w:pPr>
+      <w:r>
+        <w:t>Success rate: whether the episode ended with successful dropoff.</w:t>
+      </w:r>
+    </w:p>
+    <w:p>
+      <w:pPr>
+        <w:pStyle w:val="ListBullet"/>
+      </w:pPr>
+      <w:r>
+        <w:t>Illegal actions: number of illegal pickup/dropoff actions.</w:t>
+      </w:r>
+    </w:p>
+    <w:p>
+      <w:pPr>
+        <w:pStyle w:val="ListBullet"/>
+      </w:pPr>
+      <w:r>
+        <w:t>Episode length: number of steps taken.</w:t>
+      </w:r>
+    </w:p>
+    <w:p>
+      <w:pPr>
         <w:pStyle w:val="Heading1"/>
       </w:pPr>
       <w:r>
-        <w:t>8. Plots Included in the Submission</w:t>
+        <w:t>8. Best Policy Visualization</w:t>
       </w:r>
     </w:p>
     <w:p>
       <w:r>
-        <w:t>The code is configured to generate at most 8 plots:</w:t>
-      </w:r>
-    </w:p>
-    <w:p>
-      <w:r>
-        <w:t>1. Ablation - base - Environment Reward.</w:t>
-      </w:r>
-    </w:p>
-    <w:p>
-      <w:r>
-        <w:t>2. Ablation - base - Success Rate.</w:t>
-      </w:r>
-    </w:p>
-    <w:p>
-      <w:r>
-        <w:t>3. Ablation - reward_4 - Environment Reward.</w:t>
-      </w:r>
-    </w:p>
-    <w:p>
-      <w:r>
-        <w:t>4. Ablation - reward_4 - Success Rate.</w:t>
-      </w:r>
-    </w:p>
-    <w:p>
-      <w:r>
-        <w:t>5. Reward Comparison - Environment Reward.</w:t>
-      </w:r>
-    </w:p>
-    <w:p>
-      <w:r>
-        <w:t>6. Reward Comparison - Success Rate.</w:t>
-      </w:r>
-    </w:p>
-    <w:p>
-      <w:r>
-        <w:t>7. Parameter Sweep Heatmap - base - Environment Reward.</w:t>
-      </w:r>
-    </w:p>
-    <w:p>
-      <w:r>
-        <w:t>8. Parameter Sweep Heatmap - reward_4 - Environment Reward.</w:t>
-      </w:r>
-    </w:p>
-    <w:p>
-      <w:r>
-        <w:t>The expected plot files are:</w:t>
-      </w:r>
-    </w:p>
-    <w:p>
-      <w:pPr>
-        <w:pStyle w:val="CodeBlock"/>
-      </w:pPr>
-      <w:r>
-        <w:rPr>
-          <w:rFonts w:ascii="Courier New" w:hAnsi="Courier New"/>
-          <w:sz w:val="18"/>
-        </w:rPr>
-        <w:t>results/ablation_base_env_reward.png</w:t>
-      </w:r>
-    </w:p>
-    <w:p>
-      <w:pPr>
-        <w:pStyle w:val="CodeBlock"/>
-      </w:pPr>
-      <w:r>
-        <w:rPr>
-          <w:rFonts w:ascii="Courier New" w:hAnsi="Courier New"/>
-          <w:sz w:val="18"/>
-        </w:rPr>
-        <w:t>results/ablation_base_success.png</w:t>
-      </w:r>
-    </w:p>
-    <w:p>
-      <w:pPr>
-        <w:pStyle w:val="CodeBlock"/>
-      </w:pPr>
-      <w:r>
-        <w:rPr>
-          <w:rFonts w:ascii="Courier New" w:hAnsi="Courier New"/>
-          <w:sz w:val="18"/>
-        </w:rPr>
-        <w:t>results/ablation_reward_4_env_reward.png</w:t>
-      </w:r>
-    </w:p>
-    <w:p>
-      <w:pPr>
-        <w:pStyle w:val="CodeBlock"/>
-      </w:pPr>
-      <w:r>
-        <w:rPr>
-          <w:rFonts w:ascii="Courier New" w:hAnsi="Courier New"/>
-          <w:sz w:val="18"/>
-        </w:rPr>
-        <w:t>results/ablation_reward_4_success.png</w:t>
-      </w:r>
-    </w:p>
-    <w:p>
-      <w:pPr>
-        <w:pStyle w:val="CodeBlock"/>
-      </w:pPr>
-      <w:r>
-        <w:rPr>
-          <w:rFonts w:ascii="Courier New" w:hAnsi="Courier New"/>
-          <w:sz w:val="18"/>
-        </w:rPr>
-        <w:t>results/reward_comparison_env_reward.png</w:t>
-      </w:r>
-    </w:p>
-    <w:p>
-      <w:pPr>
-        <w:pStyle w:val="CodeBlock"/>
-      </w:pPr>
-      <w:r>
-        <w:rPr>
-          <w:rFonts w:ascii="Courier New" w:hAnsi="Courier New"/>
-          <w:sz w:val="18"/>
-        </w:rPr>
-        <w:t>results/reward_comparison_success.png</w:t>
-      </w:r>
-    </w:p>
-    <w:p>
-      <w:pPr>
-        <w:pStyle w:val="CodeBlock"/>
-      </w:pPr>
-      <w:r>
-        <w:rPr>
-          <w:rFonts w:ascii="Courier New" w:hAnsi="Courier New"/>
-          <w:sz w:val="18"/>
-        </w:rPr>
-        <w:t>results/parameter_sweep_base_env_reward_heatmap.png</w:t>
-      </w:r>
-    </w:p>
-    <w:p>
-      <w:pPr>
-        <w:pStyle w:val="CodeBlock"/>
-      </w:pPr>
-      <w:r>
-        <w:rPr>
-          <w:rFonts w:ascii="Courier New" w:hAnsi="Courier New"/>
-          <w:sz w:val="18"/>
-        </w:rPr>
-        <w:t>results/parameter_sweep_reward_4_env_reward_heatmap.png</w:t>
-      </w:r>
-    </w:p>
-    <w:p>
-      <w:r>
-        <w:t>All noisy learning curves are smoothed with a rolling mean. In the full configuration the smoothing window is 50 episodes, grouped by configuration and seed before plotting.</w:t>
-      </w:r>
-    </w:p>
-    <w:p>
-      <w:pPr>
-        <w:pStyle w:val="Heading1"/>
-      </w:pPr>
-      <w:r>
-        <w:t>9. Results and Interpretation</w:t>
-      </w:r>
-    </w:p>
-    <w:p>
-      <w:r>
-        <w:t>This section should be regenerated after running the final code once with:</w:t>
-      </w:r>
-    </w:p>
-    <w:p>
-      <w:pPr>
-        <w:pStyle w:val="CodeBlock"/>
-      </w:pPr>
-      <w:r>
-        <w:rPr>
-          <w:rFonts w:ascii="Courier New" w:hAnsi="Courier New"/>
-          <w:sz w:val="18"/>
-        </w:rPr>
-        <w:t>python main.py</w:t>
-      </w:r>
-    </w:p>
-    <w:p>
-      <w:r>
-        <w:t xml:space="preserve">The reason is that </w:t>
-      </w:r>
-      <w:r>
-        <w:rPr>
-          <w:rFonts w:ascii="Courier New" w:hAnsi="Courier New"/>
-          <w:sz w:val="20"/>
-        </w:rPr>
-        <w:t>reward_5</w:t>
-      </w:r>
-      <w:r>
-        <w:t xml:space="preserve"> was updated to Composite Remaining Path after earlier result files were produced. The ablation and parameter-sweep plots for base and reward_4 remain conceptually unaffected by this update, but the reward-comparison plots should be regenerated for consistency.</w:t>
-      </w:r>
-    </w:p>
-    <w:p>
-      <w:pPr>
-        <w:pStyle w:val="Heading2"/>
-      </w:pPr>
-      <w:r>
-        <w:t>9.1 Ablation Results</w:t>
-      </w:r>
-    </w:p>
-    <w:p>
-      <w:r>
-        <w:t>The ablation plots compare the effect of planning and kernel generalization. The expected pattern is:</w:t>
-      </w:r>
-    </w:p>
-    <w:p>
-      <w:pPr>
-        <w:pStyle w:val="ListBullet"/>
-      </w:pPr>
-      <w:r>
-        <w:t>Pure SARSA learns only from real experience and is usually slower.</w:t>
-      </w:r>
-    </w:p>
-    <w:p>
-      <w:pPr>
-        <w:pStyle w:val="ListBullet"/>
-      </w:pPr>
-      <w:r>
-        <w:t>Prioritized sweeping improves sample efficiency by replaying high-error transitions.</w:t>
-      </w:r>
-    </w:p>
-    <w:p>
-      <w:pPr>
-        <w:pStyle w:val="ListBullet"/>
-      </w:pPr>
-      <w:r>
-        <w:t>Kernel generalization can improve learning when nearby states share the same passenger status and destination.</w:t>
-      </w:r>
-    </w:p>
-    <w:p>
-      <w:pPr>
-        <w:pStyle w:val="ListBullet"/>
-      </w:pPr>
-      <w:r>
-        <w:t>The full framework should combine both benefits, although it can also be more sensitive to hyperparameters because both planning and generalization amplify updates.</w:t>
-      </w:r>
-    </w:p>
-    <w:p>
-      <w:r>
-        <w:t>The key interpretation is not only which line is highest, but whether planning and kernel reduce the time needed to reach high success.</w:t>
-      </w:r>
-    </w:p>
-    <w:p>
-      <w:pPr>
-        <w:pStyle w:val="Heading2"/>
-      </w:pPr>
-      <w:r>
-        <w:t>9.2 Reward Comparison Results</w:t>
-      </w:r>
-    </w:p>
-    <w:p>
-      <w:r>
-        <w:t>Reward comparison should be interpreted carefully because reward scales differ. Environment reward and success rate are the fairest common metrics across reward designs.</w:t>
-      </w:r>
-    </w:p>
-    <w:p>
-      <w:r>
-        <w:t>Expected qualitative behavior:</w:t>
-      </w:r>
-    </w:p>
-    <w:p>
-      <w:pPr>
-        <w:pStyle w:val="ListBullet"/>
-      </w:pPr>
-      <w:r>
-        <w:t>Sparse reward may learn more slowly because it gives little signal.</w:t>
-      </w:r>
-    </w:p>
-    <w:p>
-      <w:pPr>
-        <w:pStyle w:val="ListBullet"/>
-      </w:pPr>
-      <w:r>
-        <w:t>Dense progress reward should learn navigation faster.</w:t>
-      </w:r>
-    </w:p>
-    <w:p>
-      <w:pPr>
-        <w:pStyle w:val="ListBullet"/>
-      </w:pPr>
-      <w:r>
-        <w:t>Subgoal safety reward should reduce illegal actions and encourage successful pickup/dropoff.</w:t>
-      </w:r>
-    </w:p>
-    <w:p>
-      <w:pPr>
-        <w:pStyle w:val="ListBullet"/>
-      </w:pPr>
-      <w:r>
-        <w:t>Composite Remaining Path reward should provide a more global task signal, but may be affected by Taxi walls because it uses Manhattan distance as an approximation.</w:t>
-      </w:r>
-    </w:p>
-    <w:p>
-      <w:pPr>
-        <w:pStyle w:val="Heading2"/>
-      </w:pPr>
-      <w:r>
-        <w:t>9.3 Parameter Sweep Results</w:t>
-      </w:r>
-    </w:p>
-    <w:p>
-      <w:r>
-        <w:t>The heatmaps report mean final environment reward over the last 50 episodes. They compare low versus high learning rate and low versus high planning depth.</w:t>
-      </w:r>
-    </w:p>
-    <w:p>
-      <w:r>
-        <w:t>A useful interpretation:</w:t>
-      </w:r>
-    </w:p>
-    <w:p>
-      <w:pPr>
-        <w:pStyle w:val="ListBullet"/>
-      </w:pPr>
-      <w:r>
-        <w:t>Higher planning steps can improve learning by using the model more often.</w:t>
-      </w:r>
-    </w:p>
-    <w:p>
-      <w:pPr>
-        <w:pStyle w:val="ListBullet"/>
-      </w:pPr>
-      <w:r>
-        <w:t>Too many planning updates may increase runtime and may amplify imperfect estimates.</w:t>
-      </w:r>
-    </w:p>
-    <w:p>
-      <w:pPr>
-        <w:pStyle w:val="ListBullet"/>
-      </w:pPr>
-      <w:r>
-        <w:t>Higher alpha can learn faster but may be less stable.</w:t>
-      </w:r>
-    </w:p>
-    <w:p>
-      <w:pPr>
-        <w:pStyle w:val="ListBullet"/>
-      </w:pPr>
-      <w:r>
-        <w:t>Lower alpha can be more stable but slower.</w:t>
-      </w:r>
-    </w:p>
-    <w:p>
-      <w:pPr>
-        <w:pStyle w:val="Heading1"/>
-      </w:pPr>
-      <w:r>
-        <w:t>10. Best Policy Visualization</w:t>
-      </w:r>
-    </w:p>
-    <w:p>
-      <w:r>
-        <w:t>The project supports Gymnasium's Taxi visualization. After training, saved policies can be rendered with:</w:t>
+        <w:t>The project supports Gymnasium's Taxi visualization. Saved policies can be animated without retraining:</w:t>
       </w:r>
     </w:p>
     <w:p>
@@ -1749,7 +1112,7 @@
     </w:p>
     <w:p>
       <w:r>
-        <w:t>To visualize only one seed:</w:t>
+        <w:t>Specific reward designs can be visualized with:</w:t>
       </w:r>
     </w:p>
     <w:p>
@@ -1761,12 +1124,7 @@
           <w:rFonts w:ascii="Courier New" w:hAnsi="Courier New"/>
           <w:sz w:val="18"/>
         </w:rPr>
-        <w:t>python main.py --visualize-saved --seed 1</w:t>
-      </w:r>
-    </w:p>
-    <w:p>
-      <w:r>
-        <w:t>To visualize a specific reward and agent:</w:t>
+        <w:t>python main.py --visualize-saved --visualize-reward base --seed 2</w:t>
       </w:r>
     </w:p>
     <w:p>
@@ -1778,12 +1136,48 @@
           <w:rFonts w:ascii="Courier New" w:hAnsi="Courier New"/>
           <w:sz w:val="18"/>
         </w:rPr>
-        <w:t>python main.py --visualize-saved --visualize-agent full --visualize-reward reward_4 --seed 1</w:t>
+        <w:t>python main.py --visualize-saved --visualize-reward sparse --seed 2</w:t>
+      </w:r>
+    </w:p>
+    <w:p>
+      <w:pPr>
+        <w:pStyle w:val="CodeBlock"/>
+      </w:pPr>
+      <w:r>
+        <w:rPr>
+          <w:rFonts w:ascii="Courier New" w:hAnsi="Courier New"/>
+          <w:sz w:val="18"/>
+        </w:rPr>
+        <w:t>python main.py --visualize-saved --visualize-reward reward_3 --seed 2</w:t>
+      </w:r>
+    </w:p>
+    <w:p>
+      <w:pPr>
+        <w:pStyle w:val="CodeBlock"/>
+      </w:pPr>
+      <w:r>
+        <w:rPr>
+          <w:rFonts w:ascii="Courier New" w:hAnsi="Courier New"/>
+          <w:sz w:val="18"/>
+        </w:rPr>
+        <w:t>python main.py --visualize-saved --visualize-reward reward_4 --seed 2</w:t>
+      </w:r>
+    </w:p>
+    <w:p>
+      <w:pPr>
+        <w:pStyle w:val="CodeBlock"/>
+      </w:pPr>
+      <w:r>
+        <w:rPr>
+          <w:rFonts w:ascii="Courier New" w:hAnsi="Courier New"/>
+          <w:sz w:val="18"/>
+        </w:rPr>
+        <w:t>python main.py --visualize-saved --visualize-reward reward_5 --seed 2</w:t>
       </w:r>
     </w:p>
     <w:p>
       <w:r>
-        <w:t>During development, the saved base full-framework policies succeeded in 4 out of 5 visualized seeds, while one seed entered a loop. This is a realistic RL outcome: different random seeds can converge to different policies, especially with exploration and function-free tabular learning. For presentation, the best successful seed should be shown, and the failed seed can be discussed as a useful example of seed variability.</w:t>
+        <w:t>During development, some saved policies succeeded immediately while others entered loops for certain seeds. This is a useful reminder that a single animation is not the whole evaluation. The plots and confidence intervals are needed because Taxi learning is seed-sensitive.</w:t>
       </w:r>
     </w:p>
     <w:p>
@@ -1791,48 +1185,525 @@
         <w:pStyle w:val="Heading1"/>
       </w:pPr>
       <w:r>
-        <w:t>11. Surprising Results and Agent Behavior</w:t>
+        <w:t>9. Results and Deep Interpretation</w:t>
+      </w:r>
+    </w:p>
+    <w:p>
+      <w:pPr>
+        <w:pStyle w:val="Heading2"/>
+      </w:pPr>
+      <w:r>
+        <w:t>9.1 Component Ablation</w:t>
       </w:r>
     </w:p>
     <w:p>
       <w:r>
-        <w:t>One surprising behavior observed during visualization was that a trained policy could succeed for several seeds but fail for one seed by entering a loop. This shows that average learning curves are important: a single animation may not represent the full distribution of outcomes.</w:t>
+        <w:t>The ablation compares the contribution of prioritized sweeping and kernel generalization under the base reward.</w:t>
+      </w:r>
+    </w:p>
+    <w:p>
+      <w:pPr>
+        <w:jc w:val="center"/>
+      </w:pPr>
+      <w:r>
+        <w:drawing>
+          <wp:inline xmlns:a="http://schemas.openxmlformats.org/drawingml/2006/main" xmlns:pic="http://schemas.openxmlformats.org/drawingml/2006/picture">
+            <wp:extent cx="5943600" cy="3241964"/>
+            <wp:docPr id="1" name="Picture 1"/>
+            <wp:cNvGraphicFramePr>
+              <a:graphicFrameLocks noChangeAspect="1"/>
+            </wp:cNvGraphicFramePr>
+            <a:graphic>
+              <a:graphicData uri="http://schemas.openxmlformats.org/drawingml/2006/picture">
+                <pic:pic>
+                  <pic:nvPicPr>
+                    <pic:cNvPr id="0" name="ablation_base_env_reward.png"/>
+                    <pic:cNvPicPr/>
+                  </pic:nvPicPr>
+                  <pic:blipFill>
+                    <a:blip r:embed="rId9"/>
+                    <a:stretch>
+                      <a:fillRect/>
+                    </a:stretch>
+                  </pic:blipFill>
+                  <pic:spPr>
+                    <a:xfrm>
+                      <a:off x="0" y="0"/>
+                      <a:ext cx="5943600" cy="3241964"/>
+                    </a:xfrm>
+                    <a:prstGeom prst="rect"/>
+                  </pic:spPr>
+                </pic:pic>
+              </a:graphicData>
+            </a:graphic>
+          </wp:inline>
+        </w:drawing>
+      </w:r>
+    </w:p>
+    <w:p>
+      <w:pPr>
+        <w:pStyle w:val="Caption"/>
+      </w:pPr>
+      <w:r>
+        <w:t>Figure: Ablation base environment reward</w:t>
+      </w:r>
+    </w:p>
+    <w:p>
+      <w:pPr>
+        <w:jc w:val="center"/>
+      </w:pPr>
+      <w:r>
+        <w:drawing>
+          <wp:inline xmlns:a="http://schemas.openxmlformats.org/drawingml/2006/main" xmlns:pic="http://schemas.openxmlformats.org/drawingml/2006/picture">
+            <wp:extent cx="5943600" cy="3241964"/>
+            <wp:docPr id="2" name="Picture 2"/>
+            <wp:cNvGraphicFramePr>
+              <a:graphicFrameLocks noChangeAspect="1"/>
+            </wp:cNvGraphicFramePr>
+            <a:graphic>
+              <a:graphicData uri="http://schemas.openxmlformats.org/drawingml/2006/picture">
+                <pic:pic>
+                  <pic:nvPicPr>
+                    <pic:cNvPr id="0" name="ablation_base_success.png"/>
+                    <pic:cNvPicPr/>
+                  </pic:nvPicPr>
+                  <pic:blipFill>
+                    <a:blip r:embed="rId10"/>
+                    <a:stretch>
+                      <a:fillRect/>
+                    </a:stretch>
+                  </pic:blipFill>
+                  <pic:spPr>
+                    <a:xfrm>
+                      <a:off x="0" y="0"/>
+                      <a:ext cx="5943600" cy="3241964"/>
+                    </a:xfrm>
+                    <a:prstGeom prst="rect"/>
+                  </pic:spPr>
+                </pic:pic>
+              </a:graphicData>
+            </a:graphic>
+          </wp:inline>
+        </w:drawing>
+      </w:r>
+    </w:p>
+    <w:p>
+      <w:pPr>
+        <w:pStyle w:val="Caption"/>
+      </w:pPr>
+      <w:r>
+        <w:t>Figure: Ablation base success rate</w:t>
       </w:r>
     </w:p>
     <w:p>
       <w:r>
-        <w:t>Another important observation is that the Taxi visualization appears to jump between grid cells. This is expected because Taxi-v4 is a discrete grid environment. The environment does not simulate continuous vehicle movement; it displays one state after each action.</w:t>
+        <w:t>In the final 50-episode tail, all four base-reward setups reached 100% success in the current results. The final mean environment reward was approximately:</w:t>
       </w:r>
     </w:p>
     <w:p>
       <w:pPr>
-        <w:pStyle w:val="Heading1"/>
+        <w:pStyle w:val="CodeBlock"/>
       </w:pPr>
       <w:r>
-        <w:t>12. Exploration vs. Exploitation</w:t>
+        <w:rPr>
+          <w:rFonts w:ascii="Courier New" w:hAnsi="Courier New"/>
+          <w:sz w:val="18"/>
+        </w:rPr>
+        <w:t>Pure SARSA:          4.98</w:t>
+      </w:r>
+    </w:p>
+    <w:p>
+      <w:pPr>
+        <w:pStyle w:val="CodeBlock"/>
+      </w:pPr>
+      <w:r>
+        <w:rPr>
+          <w:rFonts w:ascii="Courier New" w:hAnsi="Courier New"/>
+          <w:sz w:val="18"/>
+        </w:rPr>
+        <w:t>SARSA + Planning:    2.73</w:t>
+      </w:r>
+    </w:p>
+    <w:p>
+      <w:pPr>
+        <w:pStyle w:val="CodeBlock"/>
+      </w:pPr>
+      <w:r>
+        <w:rPr>
+          <w:rFonts w:ascii="Courier New" w:hAnsi="Courier New"/>
+          <w:sz w:val="18"/>
+        </w:rPr>
+        <w:t>SARSA + Kernel:      6.66</w:t>
+      </w:r>
+    </w:p>
+    <w:p>
+      <w:pPr>
+        <w:pStyle w:val="CodeBlock"/>
+      </w:pPr>
+      <w:r>
+        <w:rPr>
+          <w:rFonts w:ascii="Courier New" w:hAnsi="Courier New"/>
+          <w:sz w:val="18"/>
+        </w:rPr>
+        <w:t>Full Framework:      5.92</w:t>
       </w:r>
     </w:p>
     <w:p>
       <w:r>
-        <w:t>Exploration is especially important early in Taxi because the agent must discover both navigation and the correct timing of pickup/dropoff. Sparse reward makes this harder: most exploratory actions produce no useful reward signal. Dense rewards reduce the exploration burden by providing intermediate feedback.</w:t>
+        <w:t>The kernel-only setup was strongest in final environment reward. This makes sense in deterministic Taxi because nearby states with the same passenger status and destination often share similar movement values. Planning alone was weaker in the final score, likely because replay can amplify early imperfect values and because the fixed planning depth may not be optimal for every phase of learning. The full framework still performs well, but its extra mechanisms increase sensitivity to hyperparameters.</w:t>
+      </w:r>
+    </w:p>
+    <w:p>
+      <w:pPr>
+        <w:pStyle w:val="Heading2"/>
+      </w:pPr>
+      <w:r>
+        <w:t>9.2 Reward Comparison</w:t>
       </w:r>
     </w:p>
     <w:p>
       <w:r>
-        <w:t>Epsilon decay balances this tradeoff. The agent begins with high exploration, then gradually becomes more exploitative after it has observed enough transitions. The dynamic decay schedule makes this behavior consistent across runs with different episode counts.</w:t>
+        <w:t>The reward comparison uses the full framework for all reward designs. Since internal training rewards have different scales, the main environment reward plot is normalized.</w:t>
+      </w:r>
+    </w:p>
+    <w:p>
+      <w:pPr>
+        <w:jc w:val="center"/>
+      </w:pPr>
+      <w:r>
+        <w:drawing>
+          <wp:inline xmlns:a="http://schemas.openxmlformats.org/drawingml/2006/main" xmlns:pic="http://schemas.openxmlformats.org/drawingml/2006/picture">
+            <wp:extent cx="5943600" cy="3241964"/>
+            <wp:docPr id="3" name="Picture 3"/>
+            <wp:cNvGraphicFramePr>
+              <a:graphicFrameLocks noChangeAspect="1"/>
+            </wp:cNvGraphicFramePr>
+            <a:graphic>
+              <a:graphicData uri="http://schemas.openxmlformats.org/drawingml/2006/picture">
+                <pic:pic>
+                  <pic:nvPicPr>
+                    <pic:cNvPr id="0" name="reward_comparison_env_reward.png"/>
+                    <pic:cNvPicPr/>
+                  </pic:nvPicPr>
+                  <pic:blipFill>
+                    <a:blip r:embed="rId11"/>
+                    <a:stretch>
+                      <a:fillRect/>
+                    </a:stretch>
+                  </pic:blipFill>
+                  <pic:spPr>
+                    <a:xfrm>
+                      <a:off x="0" y="0"/>
+                      <a:ext cx="5943600" cy="3241964"/>
+                    </a:xfrm>
+                    <a:prstGeom prst="rect"/>
+                  </pic:spPr>
+                </pic:pic>
+              </a:graphicData>
+            </a:graphic>
+          </wp:inline>
+        </w:drawing>
+      </w:r>
+    </w:p>
+    <w:p>
+      <w:pPr>
+        <w:pStyle w:val="Caption"/>
+      </w:pPr>
+      <w:r>
+        <w:t>Figure: Reward comparison normalized environment reward</w:t>
+      </w:r>
+    </w:p>
+    <w:p>
+      <w:pPr>
+        <w:jc w:val="center"/>
+      </w:pPr>
+      <w:r>
+        <w:drawing>
+          <wp:inline xmlns:a="http://schemas.openxmlformats.org/drawingml/2006/main" xmlns:pic="http://schemas.openxmlformats.org/drawingml/2006/picture">
+            <wp:extent cx="5943600" cy="3241964"/>
+            <wp:docPr id="4" name="Picture 4"/>
+            <wp:cNvGraphicFramePr>
+              <a:graphicFrameLocks noChangeAspect="1"/>
+            </wp:cNvGraphicFramePr>
+            <a:graphic>
+              <a:graphicData uri="http://schemas.openxmlformats.org/drawingml/2006/picture">
+                <pic:pic>
+                  <pic:nvPicPr>
+                    <pic:cNvPr id="0" name="reward_comparison_success.png"/>
+                    <pic:cNvPicPr/>
+                  </pic:nvPicPr>
+                  <pic:blipFill>
+                    <a:blip r:embed="rId12"/>
+                    <a:stretch>
+                      <a:fillRect/>
+                    </a:stretch>
+                  </pic:blipFill>
+                  <pic:spPr>
+                    <a:xfrm>
+                      <a:off x="0" y="0"/>
+                      <a:ext cx="5943600" cy="3241964"/>
+                    </a:xfrm>
+                    <a:prstGeom prst="rect"/>
+                  </pic:spPr>
+                </pic:pic>
+              </a:graphicData>
+            </a:graphic>
+          </wp:inline>
+        </w:drawing>
+      </w:r>
+    </w:p>
+    <w:p>
+      <w:pPr>
+        <w:pStyle w:val="Caption"/>
+      </w:pPr>
+      <w:r>
+        <w:t>Figure: Reward comparison success rate</w:t>
       </w:r>
     </w:p>
     <w:p>
       <w:r>
-        <w:t>Planning changes this balance indirectly. Prioritized sweeping allows the agent to exploit its internal model more aggressively, but the planning next-action still uses epsilon-greedy SARSA selection. This keeps the planning updates aligned with the on-policy learning rule.</w:t>
+        <w:t>Over the final 50 episodes per seed, the approximate results were:</w:t>
       </w:r>
     </w:p>
     <w:p>
       <w:pPr>
+        <w:pStyle w:val="CodeBlock"/>
+      </w:pPr>
+      <w:r>
+        <w:rPr>
+          <w:rFonts w:ascii="Courier New" w:hAnsi="Courier New"/>
+          <w:sz w:val="18"/>
+        </w:rPr>
+        <w:t>Base:       env 5.92,    success 1.000, illegal 0.08, normalized 0.999</w:t>
+      </w:r>
+    </w:p>
+    <w:p>
+      <w:pPr>
+        <w:pStyle w:val="CodeBlock"/>
+      </w:pPr>
+      <w:r>
+        <w:rPr>
+          <w:rFonts w:ascii="Courier New" w:hAnsi="Courier New"/>
+          <w:sz w:val="18"/>
+        </w:rPr>
+        <w:t>Sparse:     env -87.62,  success 0.912, illegal 7.94, normalized 0.952</w:t>
+      </w:r>
+    </w:p>
+    <w:p>
+      <w:pPr>
+        <w:pStyle w:val="CodeBlock"/>
+      </w:pPr>
+      <w:r>
+        <w:rPr>
+          <w:rFonts w:ascii="Courier New" w:hAnsi="Courier New"/>
+          <w:sz w:val="18"/>
+        </w:rPr>
+        <w:t>Reward 3:   env -211.02, success 0.264, illegal 7.12, normalized 0.891</w:t>
+      </w:r>
+    </w:p>
+    <w:p>
+      <w:pPr>
+        <w:pStyle w:val="CodeBlock"/>
+      </w:pPr>
+      <w:r>
+        <w:rPr>
+          <w:rFonts w:ascii="Courier New" w:hAnsi="Courier New"/>
+          <w:sz w:val="18"/>
+        </w:rPr>
+        <w:t>Reward 4:   env -249.19, success 0.104, illegal 7.62, normalized 0.872</w:t>
+      </w:r>
+    </w:p>
+    <w:p>
+      <w:pPr>
+        <w:pStyle w:val="CodeBlock"/>
+      </w:pPr>
+      <w:r>
+        <w:rPr>
+          <w:rFonts w:ascii="Courier New" w:hAnsi="Courier New"/>
+          <w:sz w:val="18"/>
+        </w:rPr>
+        <w:t>Reward 5:   env 3.82,    success 1.000, illegal 0.09, normalized 0.998</w:t>
+      </w:r>
+    </w:p>
+    <w:p>
+      <w:r>
+        <w:t>The important conclusion is not that custom rewards are always better. Reward 5 worked very well because it gave a global route-shortening signal while keeping the scale moderate. Sparse reward eventually learned in many episodes, but its weak signal left many illegal actions. Rewards 3 and 4 had reasonable design logic, but under the shared hyperparameters they were harder to optimize. Reward 4's strong penalties seem especially sensitive to the learning rate and planning depth, which is supported by the parameter sweep.</w:t>
+      </w:r>
+    </w:p>
+    <w:p>
+      <w:pPr>
+        <w:pStyle w:val="Heading2"/>
+      </w:pPr>
+      <w:r>
+        <w:t>9.3 Parameter Sweep</w:t>
+      </w:r>
+    </w:p>
+    <w:p>
+      <w:r>
+        <w:t>The parameter sweep compares learning rate and planning depth for the base reward and Reward 4.</w:t>
+      </w:r>
+    </w:p>
+    <w:p>
+      <w:pPr>
+        <w:jc w:val="center"/>
+      </w:pPr>
+      <w:r>
+        <w:drawing>
+          <wp:inline xmlns:a="http://schemas.openxmlformats.org/drawingml/2006/main" xmlns:pic="http://schemas.openxmlformats.org/drawingml/2006/picture">
+            <wp:extent cx="5943600" cy="4245429"/>
+            <wp:docPr id="5" name="Picture 5"/>
+            <wp:cNvGraphicFramePr>
+              <a:graphicFrameLocks noChangeAspect="1"/>
+            </wp:cNvGraphicFramePr>
+            <a:graphic>
+              <a:graphicData uri="http://schemas.openxmlformats.org/drawingml/2006/picture">
+                <pic:pic>
+                  <pic:nvPicPr>
+                    <pic:cNvPr id="0" name="parameter_sweep_base_env_reward_heatmap.png"/>
+                    <pic:cNvPicPr/>
+                  </pic:nvPicPr>
+                  <pic:blipFill>
+                    <a:blip r:embed="rId13"/>
+                    <a:stretch>
+                      <a:fillRect/>
+                    </a:stretch>
+                  </pic:blipFill>
+                  <pic:spPr>
+                    <a:xfrm>
+                      <a:off x="0" y="0"/>
+                      <a:ext cx="5943600" cy="4245429"/>
+                    </a:xfrm>
+                    <a:prstGeom prst="rect"/>
+                  </pic:spPr>
+                </pic:pic>
+              </a:graphicData>
+            </a:graphic>
+          </wp:inline>
+        </w:drawing>
+      </w:r>
+    </w:p>
+    <w:p>
+      <w:pPr>
+        <w:pStyle w:val="Caption"/>
+      </w:pPr>
+      <w:r>
+        <w:t>Figure: Parameter sweep base heatmap</w:t>
+      </w:r>
+    </w:p>
+    <w:p>
+      <w:pPr>
+        <w:jc w:val="center"/>
+      </w:pPr>
+      <w:r>
+        <w:drawing>
+          <wp:inline xmlns:a="http://schemas.openxmlformats.org/drawingml/2006/main" xmlns:pic="http://schemas.openxmlformats.org/drawingml/2006/picture">
+            <wp:extent cx="5943600" cy="4245429"/>
+            <wp:docPr id="6" name="Picture 6"/>
+            <wp:cNvGraphicFramePr>
+              <a:graphicFrameLocks noChangeAspect="1"/>
+            </wp:cNvGraphicFramePr>
+            <a:graphic>
+              <a:graphicData uri="http://schemas.openxmlformats.org/drawingml/2006/picture">
+                <pic:pic>
+                  <pic:nvPicPr>
+                    <pic:cNvPr id="0" name="parameter_sweep_reward_4_env_reward_heatmap.png"/>
+                    <pic:cNvPicPr/>
+                  </pic:nvPicPr>
+                  <pic:blipFill>
+                    <a:blip r:embed="rId14"/>
+                    <a:stretch>
+                      <a:fillRect/>
+                    </a:stretch>
+                  </pic:blipFill>
+                  <pic:spPr>
+                    <a:xfrm>
+                      <a:off x="0" y="0"/>
+                      <a:ext cx="5943600" cy="4245429"/>
+                    </a:xfrm>
+                    <a:prstGeom prst="rect"/>
+                  </pic:spPr>
+                </pic:pic>
+              </a:graphicData>
+            </a:graphic>
+          </wp:inline>
+        </w:drawing>
+      </w:r>
+    </w:p>
+    <w:p>
+      <w:pPr>
+        <w:pStyle w:val="Caption"/>
+      </w:pPr>
+      <w:r>
+        <w:t>Figure: Parameter sweep reward 4 heatmap</w:t>
+      </w:r>
+    </w:p>
+    <w:p>
+      <w:r>
+        <w:t>The strongest tested base setting was alpha = 0.8 with n = 10, with final mean environment reward around -91.48 and final success around 0.968. The strongest tested Reward 4 setting was alpha = 0.8 with n = 2, with final mean environment reward around -107.56 and final success around 0.912.</w:t>
+      </w:r>
+    </w:p>
+    <w:p>
+      <w:r>
+        <w:t>This result shows that the same hyperparameters are not equally good for every reward. Reward 4 has sharper penalties and therefore needs a learning rate that moves values enough to overcome early negative experience. However, increasing planning depth from 2 to 10 did not help Reward 4 in the tested settings, suggesting that planning can replay penalty-heavy estimates too aggressively.</w:t>
+      </w:r>
+    </w:p>
+    <w:p>
+      <w:pPr>
         <w:pStyle w:val="Heading1"/>
       </w:pPr>
       <w:r>
-        <w:t>13. Pragmatic Engineering Choices</w:t>
+        <w:t>10. Surprising Results and Agent Behavior</w:t>
+      </w:r>
+    </w:p>
+    <w:p>
+      <w:r>
+        <w:t>One surprising behavior was that some saved policies entered loops even when other seeds succeeded. This happened during greedy visualization, where epsilon is set to zero. A learned Q-table can be strong on average but still contain local action preferences that cycle for a particular start state.</w:t>
+      </w:r>
+    </w:p>
+    <w:p>
+      <w:r>
+        <w:t>Another surprising result was that the most carefully penalized reward, Reward 4, did not dominate in the reward comparison. Its design is logical, but strong penalties can make the learning signal harsh. If early exploration produces many illegal actions, planning can replay those negative updates and slow down useful behavior unless the hyperparameters are tuned.</w:t>
+      </w:r>
+    </w:p>
+    <w:p>
+      <w:r>
+        <w:t>Finally, the Taxi animation appears to jump between cells. This is expected because Taxi-v4 is a discrete gridworld. The renderer displays one state per action; it does not simulate continuous driving.</w:t>
+      </w:r>
+    </w:p>
+    <w:p>
+      <w:pPr>
+        <w:pStyle w:val="Heading1"/>
+      </w:pPr>
+      <w:r>
+        <w:t>11. Exploration vs. Exploitation</w:t>
+      </w:r>
+    </w:p>
+    <w:p>
+      <w:r>
+        <w:t>Exploration is most difficult for sparse reward. The agent receives almost no signal until the final dropoff, so early exploration often looks random and unproductive. Dense rewards reduce this burden by giving feedback before the full task is solved.</w:t>
+      </w:r>
+    </w:p>
+    <w:p>
+      <w:r>
+        <w:t>Base reward gives a useful balance because every step is penalized, illegal actions are strongly penalized, and successful dropoff gives a large positive reward. Reward 5 also gives useful intermediate feedback because reducing the remaining task distance is rewarded.</w:t>
+      </w:r>
+    </w:p>
+    <w:p>
+      <w:r>
+        <w:t>Prioritized sweeping changes the exploration-exploitation tradeoff indirectly. It lets the agent exploit its internal model by replaying important transitions, but those transitions come from past exploration. If early exploration discovers useful transitions, planning accelerates learning. If early exploration mostly discovers bad transitions, planning may replay those too.</w:t>
+      </w:r>
+    </w:p>
+    <w:p>
+      <w:r>
+        <w:t>Kernel generalization also changes the tradeoff. It exploits spatial similarity: learning from one taxi position can help nearby compatible positions. This improves sample efficiency, but only because the kernel is restricted to states with the same passenger status and destination.</w:t>
+      </w:r>
+    </w:p>
+    <w:p>
+      <w:pPr>
+        <w:pStyle w:val="Heading1"/>
+      </w:pPr>
+      <w:r>
+        <w:t>12. Pragmatic Engineering Choices</w:t>
       </w:r>
     </w:p>
     <w:p>
@@ -1845,7 +1716,7 @@
         <w:pStyle w:val="ListBullet"/>
       </w:pPr>
       <w:r>
-        <w:t>Kernel neighbors are precomputed once at agent creation.</w:t>
+        <w:t>Kernel neighbors are precomputed once when the agent is created.</w:t>
       </w:r>
     </w:p>
     <w:p>
@@ -1853,7 +1724,7 @@
         <w:pStyle w:val="ListBullet"/>
       </w:pPr>
       <w:r>
-        <w:t>Only the nearest kernel neighbors are used.</w:t>
+        <w:t>Only the closest kernel neighbors are used.</w:t>
       </w:r>
     </w:p>
     <w:p>
@@ -1877,7 +1748,7 @@
         <w:pStyle w:val="ListBullet"/>
       </w:pPr>
       <w:r>
-        <w:t>The parameter sweep is compact.</w:t>
+        <w:t>Kernel updates are not applied inside every planning step by default.</w:t>
       </w:r>
     </w:p>
     <w:p>
@@ -1885,7 +1756,7 @@
         <w:pStyle w:val="ListBullet"/>
       </w:pPr>
       <w:r>
-        <w:t>Only 8 plots are generated.</w:t>
+        <w:t>Plots use rolling mean smoothing to make noisy learning curves readable.</w:t>
       </w:r>
     </w:p>
     <w:p>
@@ -1893,7 +1764,7 @@
         <w:pStyle w:val="ListBullet"/>
       </w:pPr>
       <w:r>
-        <w:t>Models are saved so policies can be visualized without retraining.</w:t>
+        <w:t>Model artifacts are saved so visualization does not require retraining.</w:t>
       </w:r>
     </w:p>
     <w:p>
@@ -1901,7 +1772,7 @@
         <w:pStyle w:val="ListBullet"/>
       </w:pPr>
       <w:r>
-        <w:t xml:space="preserve">A </w:t>
+        <w:t xml:space="preserve">A one-seed command and a short </w:t>
       </w:r>
       <w:r>
         <w:rPr>
@@ -1911,12 +1782,12 @@
         <w:t>--fast</w:t>
       </w:r>
       <w:r>
-        <w:t xml:space="preserve"> mode runs a single-seed short experiment for debugging.</w:t>
+        <w:t xml:space="preserve"> command are provided for checking.</w:t>
       </w:r>
     </w:p>
     <w:p>
       <w:r>
-        <w:t>These choices reduce runtime while preserving the core scientific comparisons required by the project.</w:t>
+        <w:t>These choices reduce runtime while preserving the core scientific comparisons.</w:t>
       </w:r>
     </w:p>
     <w:p>
@@ -1924,7 +1795,7 @@
         <w:pStyle w:val="Heading1"/>
       </w:pPr>
       <w:r>
-        <w:t>14. Quick Start</w:t>
+        <w:t>13. Quick Start</w:t>
       </w:r>
     </w:p>
     <w:p>
@@ -1963,7 +1834,7 @@
     </w:p>
     <w:p>
       <w:r>
-        <w:t>Run a faster single-seed check:</w:t>
+        <w:t>Run a one-seed check:</w:t>
       </w:r>
     </w:p>
     <w:p>
@@ -1997,7 +1868,7 @@
     </w:p>
     <w:p>
       <w:r>
-        <w:t>Visualize saved trained policies:</w:t>
+        <w:t>Visualize saved policies:</w:t>
       </w:r>
     </w:p>
     <w:p>
@@ -2014,7 +1885,7 @@
     </w:p>
     <w:p>
       <w:r>
-        <w:t>Explain one episode step by step:</w:t>
+        <w:t>Explain one saved episode step by step:</w:t>
       </w:r>
     </w:p>
     <w:p>
@@ -2030,11 +1901,76 @@
       </w:r>
     </w:p>
     <w:p>
+      <w:r>
+        <w:t>Important files:</w:t>
+      </w:r>
+    </w:p>
+    <w:p>
+      <w:pPr>
+        <w:pStyle w:val="CodeBlock"/>
+      </w:pPr>
+      <w:r>
+        <w:rPr>
+          <w:rFonts w:ascii="Courier New" w:hAnsi="Courier New"/>
+          <w:sz w:val="18"/>
+        </w:rPr>
+        <w:t>agent.py       - SARSA, prioritized sweeping, kernel generalization</w:t>
+      </w:r>
+    </w:p>
+    <w:p>
+      <w:pPr>
+        <w:pStyle w:val="CodeBlock"/>
+      </w:pPr>
+      <w:r>
+        <w:rPr>
+          <w:rFonts w:ascii="Courier New" w:hAnsi="Courier New"/>
+          <w:sz w:val="18"/>
+        </w:rPr>
+        <w:t>main.py        - rewards, experiments, plots, model saving, CLI</w:t>
+      </w:r>
+    </w:p>
+    <w:p>
+      <w:pPr>
+        <w:pStyle w:val="CodeBlock"/>
+      </w:pPr>
+      <w:r>
+        <w:rPr>
+          <w:rFonts w:ascii="Courier New" w:hAnsi="Courier New"/>
+          <w:sz w:val="18"/>
+        </w:rPr>
+        <w:t>visualize.py   - Gymnasium Taxi visualization</w:t>
+      </w:r>
+    </w:p>
+    <w:p>
+      <w:pPr>
+        <w:pStyle w:val="CodeBlock"/>
+      </w:pPr>
+      <w:r>
+        <w:rPr>
+          <w:rFonts w:ascii="Courier New" w:hAnsi="Courier New"/>
+          <w:sz w:val="18"/>
+        </w:rPr>
+        <w:t>results/       - CSV files, plots, saved models</w:t>
+      </w:r>
+    </w:p>
+    <w:p>
+      <w:pPr>
+        <w:pStyle w:val="CodeBlock"/>
+      </w:pPr>
+      <w:r>
+        <w:rPr>
+          <w:rFonts w:ascii="Courier New" w:hAnsi="Courier New"/>
+          <w:sz w:val="18"/>
+        </w:rPr>
+        <w:t>reports/       - report artifacts</w:t>
+      </w:r>
+    </w:p>
+    <w:p>
       <w:pPr>
         <w:pStyle w:val="Heading1"/>
       </w:pPr>
       <w:r>
-        <w:t>15. Project Structure</w:t>
+        <w:t>14. Project Structure</w:t>
       </w:r>
     </w:p>
     <w:p>
@@ -2070,55 +2006,7 @@
           <w:rFonts w:ascii="Courier New" w:hAnsi="Courier New"/>
           <w:sz w:val="18"/>
         </w:rPr>
-        <w:t xml:space="preserve">    GeneralizedSweepingSARSAAgent: SARSA, prioritized sweeping, kernel generalization.</w:t>
-      </w:r>
-    </w:p>
-    <w:p>
-      <w:pPr>
-        <w:pStyle w:val="CodeBlock"/>
-      </w:pPr>
-      <w:r>
-        <w:rPr>
-          <w:rFonts w:ascii="Courier New" w:hAnsi="Courier New"/>
-          <w:sz w:val="18"/>
-        </w:rPr>
-        <w:t xml:space="preserve"> </w:t>
-      </w:r>
-    </w:p>
-    <w:p>
-      <w:pPr>
-        <w:pStyle w:val="CodeBlock"/>
-      </w:pPr>
-      <w:r>
-        <w:rPr>
-          <w:rFonts w:ascii="Courier New" w:hAnsi="Courier New"/>
-          <w:sz w:val="18"/>
-        </w:rPr>
         <w:t xml:space="preserve">  main.py</w:t>
-      </w:r>
-    </w:p>
-    <w:p>
-      <w:pPr>
-        <w:pStyle w:val="CodeBlock"/>
-      </w:pPr>
-      <w:r>
-        <w:rPr>
-          <w:rFonts w:ascii="Courier New" w:hAnsi="Courier New"/>
-          <w:sz w:val="18"/>
-        </w:rPr>
-        <w:t xml:space="preserve">    Experiment runner, reward functions, plots, model saving/loading, CLI.</w:t>
-      </w:r>
-    </w:p>
-    <w:p>
-      <w:pPr>
-        <w:pStyle w:val="CodeBlock"/>
-      </w:pPr>
-      <w:r>
-        <w:rPr>
-          <w:rFonts w:ascii="Courier New" w:hAnsi="Courier New"/>
-          <w:sz w:val="18"/>
-        </w:rPr>
-        <w:t xml:space="preserve"> </w:t>
       </w:r>
     </w:p>
     <w:p>
@@ -2142,55 +2030,7 @@
           <w:rFonts w:ascii="Courier New" w:hAnsi="Courier New"/>
           <w:sz w:val="18"/>
         </w:rPr>
-        <w:t xml:space="preserve">    Gymnasium Taxi-v4 visualization with human/ansi fallback.</w:t>
-      </w:r>
-    </w:p>
-    <w:p>
-      <w:pPr>
-        <w:pStyle w:val="CodeBlock"/>
-      </w:pPr>
-      <w:r>
-        <w:rPr>
-          <w:rFonts w:ascii="Courier New" w:hAnsi="Courier New"/>
-          <w:sz w:val="18"/>
-        </w:rPr>
-        <w:t xml:space="preserve"> </w:t>
-      </w:r>
-    </w:p>
-    <w:p>
-      <w:pPr>
-        <w:pStyle w:val="CodeBlock"/>
-      </w:pPr>
-      <w:r>
-        <w:rPr>
-          <w:rFonts w:ascii="Courier New" w:hAnsi="Courier New"/>
-          <w:sz w:val="18"/>
-        </w:rPr>
         <w:t xml:space="preserve">  explain_simulation.py</w:t>
-      </w:r>
-    </w:p>
-    <w:p>
-      <w:pPr>
-        <w:pStyle w:val="CodeBlock"/>
-      </w:pPr>
-      <w:r>
-        <w:rPr>
-          <w:rFonts w:ascii="Courier New" w:hAnsi="Courier New"/>
-          <w:sz w:val="18"/>
-        </w:rPr>
-        <w:t xml:space="preserve">    Step-by-step explanatory simulation.</w:t>
-      </w:r>
-    </w:p>
-    <w:p>
-      <w:pPr>
-        <w:pStyle w:val="CodeBlock"/>
-      </w:pPr>
-      <w:r>
-        <w:rPr>
-          <w:rFonts w:ascii="Courier New" w:hAnsi="Courier New"/>
-          <w:sz w:val="18"/>
-        </w:rPr>
-        <w:t xml:space="preserve"> </w:t>
       </w:r>
     </w:p>
     <w:p>
@@ -2214,7 +2054,7 @@
           <w:rFonts w:ascii="Courier New" w:hAnsi="Courier New"/>
           <w:sz w:val="18"/>
         </w:rPr>
-        <w:t xml:space="preserve">    Python package list.</w:t>
+        <w:t xml:space="preserve">  results/</w:t>
       </w:r>
     </w:p>
     <w:p>
@@ -2226,7 +2066,7 @@
           <w:rFonts w:ascii="Courier New" w:hAnsi="Courier New"/>
           <w:sz w:val="18"/>
         </w:rPr>
-        <w:t xml:space="preserve"> </w:t>
+        <w:t xml:space="preserve">    component_ablation.csv</w:t>
       </w:r>
     </w:p>
     <w:p>
@@ -2238,7 +2078,7 @@
           <w:rFonts w:ascii="Courier New" w:hAnsi="Courier New"/>
           <w:sz w:val="18"/>
         </w:rPr>
-        <w:t xml:space="preserve">  results/</w:t>
+        <w:t xml:space="preserve">    reward_comparison.csv</w:t>
       </w:r>
     </w:p>
     <w:p>
@@ -2250,7 +2090,7 @@
           <w:rFonts w:ascii="Courier New" w:hAnsi="Courier New"/>
           <w:sz w:val="18"/>
         </w:rPr>
-        <w:t xml:space="preserve">    CSV files, plots, run manifest, saved models.</w:t>
+        <w:t xml:space="preserve">    parameter_sweep_seed_results.csv</w:t>
       </w:r>
     </w:p>
     <w:p>
@@ -2262,7 +2102,7 @@
           <w:rFonts w:ascii="Courier New" w:hAnsi="Courier New"/>
           <w:sz w:val="18"/>
         </w:rPr>
-        <w:t xml:space="preserve"> </w:t>
+        <w:t xml:space="preserve">    parameter_sweep_summary.csv</w:t>
       </w:r>
     </w:p>
     <w:p>
@@ -2274,7 +2114,7 @@
           <w:rFonts w:ascii="Courier New" w:hAnsi="Courier New"/>
           <w:sz w:val="18"/>
         </w:rPr>
-        <w:t xml:space="preserve">  results/models/</w:t>
+        <w:t xml:space="preserve">    *.png plots</w:t>
       </w:r>
     </w:p>
     <w:p>
@@ -2286,19 +2126,7 @@
           <w:rFonts w:ascii="Courier New" w:hAnsi="Courier New"/>
           <w:sz w:val="18"/>
         </w:rPr>
-        <w:t xml:space="preserve">    Saved .npz Q-table artifacts.</w:t>
-      </w:r>
-    </w:p>
-    <w:p>
-      <w:pPr>
-        <w:pStyle w:val="CodeBlock"/>
-      </w:pPr>
-      <w:r>
-        <w:rPr>
-          <w:rFonts w:ascii="Courier New" w:hAnsi="Courier New"/>
-          <w:sz w:val="18"/>
-        </w:rPr>
-        <w:t xml:space="preserve"> </w:t>
+        <w:t xml:space="preserve">    models/*.npz</w:t>
       </w:r>
     </w:p>
     <w:p>
@@ -2322,35 +2150,7 @@
           <w:rFonts w:ascii="Courier New" w:hAnsi="Courier New"/>
           <w:sz w:val="18"/>
         </w:rPr>
-        <w:t xml:space="preserve">    Report files.</w:t>
-      </w:r>
-    </w:p>
-    <w:p>
-      <w:pPr>
-        <w:pStyle w:val="Heading1"/>
-      </w:pPr>
-      <w:r>
-        <w:t>16. Reproducibility</w:t>
-      </w:r>
-    </w:p>
-    <w:p>
-      <w:r>
-        <w:t xml:space="preserve">The full experiment uses seeds </w:t>
-      </w:r>
-      <w:r>
-        <w:rPr>
-          <w:rFonts w:ascii="Courier New" w:hAnsi="Courier New"/>
-          <w:sz w:val="20"/>
-        </w:rPr>
-        <w:t>[1, 2, 3, 4, 5]</w:t>
-      </w:r>
-      <w:r>
-        <w:t>. Each episode reset uses a deterministic seed based on the experiment seed and episode number. Plots use 95% confidence intervals across seeds.</w:t>
-      </w:r>
-    </w:p>
-    <w:p>
-      <w:r>
-        <w:t>The project can also be checked quickly with one seed:</w:t>
+        <w:t xml:space="preserve">    final_report.md</w:t>
       </w:r>
     </w:p>
     <w:p>
@@ -2362,35 +2162,55 @@
           <w:rFonts w:ascii="Courier New" w:hAnsi="Courier New"/>
           <w:sz w:val="18"/>
         </w:rPr>
-        <w:t>python main.py --seed 1</w:t>
+        <w:t xml:space="preserve">    final_report.pdf</w:t>
+      </w:r>
+    </w:p>
+    <w:p>
+      <w:pPr>
+        <w:pStyle w:val="CodeBlock"/>
+      </w:pPr>
+      <w:r>
+        <w:rPr>
+          <w:rFonts w:ascii="Courier New" w:hAnsi="Courier New"/>
+          <w:sz w:val="18"/>
+        </w:rPr>
+        <w:t xml:space="preserve">    final_report.docx</w:t>
+      </w:r>
+    </w:p>
+    <w:p>
+      <w:pPr>
+        <w:pStyle w:val="Heading1"/>
+      </w:pPr>
+      <w:r>
+        <w:t>15. Additional Insights</w:t>
       </w:r>
     </w:p>
     <w:p>
       <w:r>
-        <w:t>This is important for graders because the full experiment can take a long time.</w:t>
-      </w:r>
-    </w:p>
-    <w:p>
-      <w:pPr>
-        <w:pStyle w:val="Heading1"/>
-      </w:pPr>
-      <w:r>
-        <w:t>17. Conclusion</w:t>
+        <w:t>Reward design should be evaluated with external metrics, not only the internal reward used for training. Otherwise, a reward with a larger numerical scale can look better even when the learned policy is worse. This is why the report emphasizes original environment reward, normalized environment reward, success rate, and illegal actions.</w:t>
       </w:r>
     </w:p>
     <w:p>
       <w:r>
-        <w:t>This project demonstrates that reward design substantially changes learning behavior in Taxi-v4. Sparse reward is simple but weak as a learning signal. Dense target progress rewards help the agent learn navigation. Subgoal safety rewards add stronger structure for pickup/dropoff correctness. The Composite Remaining Path reward provides a broader task-level signal by measuring whether the entire remaining route becomes shorter.</w:t>
+        <w:t>The best learning setup depends on the reward. Planning and generalization are not universally beneficial in the same way for every reward function. They can improve sample efficiency, but they can also amplify biased or noisy estimates. In Taxi, the most reliable improvements came from combining a meaningful intermediate signal with careful restrictions on generalization.</w:t>
+      </w:r>
+    </w:p>
+    <w:p>
+      <w:pPr>
+        <w:pStyle w:val="Heading1"/>
+      </w:pPr>
+      <w:r>
+        <w:t>16. Conclusion</w:t>
       </w:r>
     </w:p>
     <w:p>
       <w:r>
-        <w:t>Prioritized sweeping improves sample efficiency by focusing planning updates on high-error transitions. Kernel generalization spreads value information across nearby, semantically compatible Taxi states. Together, these components create a stronger learning system, but they also increase runtime and require careful implementation choices.</w:t>
+        <w:t>This project shows that reward design can substantially change the behavior of a SARSA-based Taxi agent. Sparse reward is simple but weak. Dense progress rewards are intuitive but can be sensitive to scale and penalties. Subgoal safety rewards can reduce bad behavior, but they require careful tuning. The Composite Remaining Path reward performed well because it gave a global signal aligned with the full task while staying relatively stable.</w:t>
       </w:r>
     </w:p>
     <w:p>
       <w:r>
-        <w:t>The final system is reproducible, supports 5-seed evaluation with confidence intervals, saves trained models, and provides visualization commands for presenting learned policies.</w:t>
+        <w:t>Prioritized sweeping improves learning by focusing model updates on high-error transitions. Kernel generalization spreads value information across nearby states, but only works safely when the states are semantically compatible. The final system is reproducible, supports 5-seed evaluation with confidence intervals, saves learned policies, and provides commands for both full runs and quick single-seed checks.</w:t>
       </w:r>
     </w:p>
     <w:sectPr>
@@ -3576,12 +3396,14 @@
     <w:qFormat/>
     <w:rsid w:val="00FC693F"/>
     <w:pPr>
-      <w:spacing w:line="240" w:lineRule="auto"/>
+      <w:spacing w:line="240" w:lineRule="auto" w:before="60" w:after="160"/>
+      <w:jc w:val="center"/>
     </w:pPr>
     <w:rPr>
+      <w:rFonts w:ascii="Calibri" w:hAnsi="Calibri"/>
       <w:b/>
       <w:bCs/>
-      <w:color w:val="4F81BD" w:themeColor="accent1"/>
+      <w:color w:val="595959"/>
       <w:sz w:val="18"/>
       <w:szCs w:val="18"/>
     </w:rPr>

</xml_diff>

<commit_message>
add the the requirment file
</commit_message>
<xml_diff>
--- a/reports/final_report.docx
+++ b/reports/final_report.docx
@@ -355,6 +355,11 @@
     </w:p>
     <w:p>
       <w:r>
+        <w:t>The discount factor was fixed at gamma = 0.99 across all reward comparisons, parameter sweeps, and component ablations. I kept gamma constant intentionally because changing gamma would change the discounted MDP itself and would make the reward and algorithm comparisons less meaningful.</w:t>
+      </w:r>
+    </w:p>
+    <w:p>
+      <w:r>
         <w:t>Epsilon decays over training. The decay is selected so exploration becomes much smaller after a substantial part of training, while still leaving a small amount of random action selection.</w:t>
       </w:r>
     </w:p>
@@ -1086,6 +1091,11 @@
       </w:r>
     </w:p>
     <w:p>
+      <w:r>
+        <w:t>I did not use training reward as a cross-reward comparison metric because the designed rewards have different scales. I also avoided claiming unique-state and mean-TD-error plots in the final report because those metrics are not currently saved in the main result CSV files. The analysis therefore focuses on metrics that are present, reproducible, and comparable across the saved runs.</w:t>
+      </w:r>
+    </w:p>
+    <w:p>
       <w:pPr>
         <w:pStyle w:val="Heading1"/>
       </w:pPr>
@@ -1112,7 +1122,17 @@
     </w:p>
     <w:p>
       <w:r>
-        <w:t>Specific reward designs can be visualized with:</w:t>
+        <w:t xml:space="preserve">In addition to the live command, I generated one successful saved-policy animation for each reward design. The GIF files are included in </w:t>
+      </w:r>
+      <w:r>
+        <w:rPr>
+          <w:rFonts w:ascii="Courier New" w:hAnsi="Courier New"/>
+          <w:sz w:val="20"/>
+        </w:rPr>
+        <w:t>reports/policy_animations/</w:t>
+      </w:r>
+      <w:r>
+        <w:t>:</w:t>
       </w:r>
     </w:p>
     <w:p>
@@ -1124,7 +1144,7 @@
           <w:rFonts w:ascii="Courier New" w:hAnsi="Courier New"/>
           <w:sz w:val="18"/>
         </w:rPr>
-        <w:t>python main.py --visualize-saved --visualize-reward base --seed 2</w:t>
+        <w:t>base_policy.gif</w:t>
       </w:r>
     </w:p>
     <w:p>
@@ -1136,7 +1156,7 @@
           <w:rFonts w:ascii="Courier New" w:hAnsi="Courier New"/>
           <w:sz w:val="18"/>
         </w:rPr>
-        <w:t>python main.py --visualize-saved --visualize-reward sparse --seed 2</w:t>
+        <w:t>sparse_policy.gif</w:t>
       </w:r>
     </w:p>
     <w:p>
@@ -1148,7 +1168,7 @@
           <w:rFonts w:ascii="Courier New" w:hAnsi="Courier New"/>
           <w:sz w:val="18"/>
         </w:rPr>
-        <w:t>python main.py --visualize-saved --visualize-reward reward_3 --seed 2</w:t>
+        <w:t>reward_3_policy.gif</w:t>
       </w:r>
     </w:p>
     <w:p>
@@ -1160,7 +1180,7 @@
           <w:rFonts w:ascii="Courier New" w:hAnsi="Courier New"/>
           <w:sz w:val="18"/>
         </w:rPr>
-        <w:t>python main.py --visualize-saved --visualize-reward reward_4 --seed 2</w:t>
+        <w:t>reward_4_policy.gif</w:t>
       </w:r>
     </w:p>
     <w:p>
@@ -1172,43 +1192,42 @@
           <w:rFonts w:ascii="Courier New" w:hAnsi="Courier New"/>
           <w:sz w:val="18"/>
         </w:rPr>
-        <w:t>python main.py --visualize-saved --visualize-reward reward_5 --seed 2</w:t>
+        <w:t>reward_5_policy.gif</w:t>
       </w:r>
     </w:p>
     <w:p>
       <w:r>
-        <w:t>During development, some saved policies succeeded immediately while others entered loops for certain seeds. This is a useful reminder that a single animation is not the whole evaluation. The plots and confidence intervals are needed because Taxi learning is seed-sensitive.</w:t>
+        <w:t xml:space="preserve">The GIFs were produced from Gymnasium </w:t>
+      </w:r>
+      <w:r>
+        <w:rPr>
+          <w:rFonts w:ascii="Courier New" w:hAnsi="Courier New"/>
+          <w:sz w:val="20"/>
+        </w:rPr>
+        <w:t>render_mode="rgb_array"</w:t>
+      </w:r>
+      <w:r>
+        <w:t xml:space="preserve"> frames using saved Q-tables from </w:t>
+      </w:r>
+      <w:r>
+        <w:rPr>
+          <w:rFonts w:ascii="Courier New" w:hAnsi="Courier New"/>
+          <w:sz w:val="20"/>
+        </w:rPr>
+        <w:t>results/models</w:t>
+      </w:r>
+      <w:r>
+        <w:t>. The following contact sheet shows the final frame from each successful animation:</w:t>
       </w:r>
     </w:p>
     <w:p>
       <w:pPr>
-        <w:pStyle w:val="Heading1"/>
-      </w:pPr>
-      <w:r>
-        <w:t>9. Results and Deep Interpretation</w:t>
-      </w:r>
-    </w:p>
-    <w:p>
-      <w:pPr>
-        <w:pStyle w:val="Heading2"/>
-      </w:pPr>
-      <w:r>
-        <w:t>9.1 Component Ablation</w:t>
-      </w:r>
-    </w:p>
-    <w:p>
-      <w:r>
-        <w:t>The ablation compares the contribution of prioritized sweeping and kernel generalization under the base reward.</w:t>
-      </w:r>
-    </w:p>
-    <w:p>
-      <w:pPr>
         <w:jc w:val="center"/>
       </w:pPr>
       <w:r>
         <w:drawing>
           <wp:inline xmlns:a="http://schemas.openxmlformats.org/drawingml/2006/main" xmlns:pic="http://schemas.openxmlformats.org/drawingml/2006/picture">
-            <wp:extent cx="5943600" cy="3241964"/>
+            <wp:extent cx="5943600" cy="3358791"/>
             <wp:docPr id="1" name="Picture 1"/>
             <wp:cNvGraphicFramePr>
               <a:graphicFrameLocks noChangeAspect="1"/>
@@ -1217,7 +1236,7 @@
               <a:graphicData uri="http://schemas.openxmlformats.org/drawingml/2006/picture">
                 <pic:pic>
                   <pic:nvPicPr>
-                    <pic:cNvPr id="0" name="ablation_base_env_reward.png"/>
+                    <pic:cNvPr id="0" name="policy_animation_contact_sheet.png"/>
                     <pic:cNvPicPr/>
                   </pic:nvPicPr>
                   <pic:blipFill>
@@ -1229,7 +1248,7 @@
                   <pic:spPr>
                     <a:xfrm>
                       <a:off x="0" y="0"/>
-                      <a:ext cx="5943600" cy="3241964"/>
+                      <a:ext cx="5943600" cy="3358791"/>
                     </a:xfrm>
                     <a:prstGeom prst="rect"/>
                   </pic:spPr>
@@ -1245,7 +1264,98 @@
         <w:pStyle w:val="Caption"/>
       </w:pPr>
       <w:r>
-        <w:t>Figure: Ablation base environment reward</w:t>
+        <w:t>Figure: Best policy animation contact sheet</w:t>
+      </w:r>
+    </w:p>
+    <w:p>
+      <w:r>
+        <w:t>The same policies can also be visualized live with:</w:t>
+      </w:r>
+    </w:p>
+    <w:p>
+      <w:pPr>
+        <w:pStyle w:val="CodeBlock"/>
+      </w:pPr>
+      <w:r>
+        <w:rPr>
+          <w:rFonts w:ascii="Courier New" w:hAnsi="Courier New"/>
+          <w:sz w:val="18"/>
+        </w:rPr>
+        <w:t>python main.py --visualize-saved --visualize-reward base --seed 1</w:t>
+      </w:r>
+    </w:p>
+    <w:p>
+      <w:pPr>
+        <w:pStyle w:val="CodeBlock"/>
+      </w:pPr>
+      <w:r>
+        <w:rPr>
+          <w:rFonts w:ascii="Courier New" w:hAnsi="Courier New"/>
+          <w:sz w:val="18"/>
+        </w:rPr>
+        <w:t>python main.py --visualize-saved --visualize-reward sparse --seed 1</w:t>
+      </w:r>
+    </w:p>
+    <w:p>
+      <w:pPr>
+        <w:pStyle w:val="CodeBlock"/>
+      </w:pPr>
+      <w:r>
+        <w:rPr>
+          <w:rFonts w:ascii="Courier New" w:hAnsi="Courier New"/>
+          <w:sz w:val="18"/>
+        </w:rPr>
+        <w:t>python main.py --visualize-saved --visualize-reward reward_3 --seed 1</w:t>
+      </w:r>
+    </w:p>
+    <w:p>
+      <w:pPr>
+        <w:pStyle w:val="CodeBlock"/>
+      </w:pPr>
+      <w:r>
+        <w:rPr>
+          <w:rFonts w:ascii="Courier New" w:hAnsi="Courier New"/>
+          <w:sz w:val="18"/>
+        </w:rPr>
+        <w:t>python main.py --visualize-saved --visualize-reward reward_4 --seed 1</w:t>
+      </w:r>
+    </w:p>
+    <w:p>
+      <w:pPr>
+        <w:pStyle w:val="CodeBlock"/>
+      </w:pPr>
+      <w:r>
+        <w:rPr>
+          <w:rFonts w:ascii="Courier New" w:hAnsi="Courier New"/>
+          <w:sz w:val="18"/>
+        </w:rPr>
+        <w:t>python main.py --visualize-saved --visualize-reward reward_5 --seed 1</w:t>
+      </w:r>
+    </w:p>
+    <w:p>
+      <w:r>
+        <w:t>During development, some saved policies succeeded immediately while others entered loops for certain seeds. This is a useful reminder that a single animation is not the whole evaluation. The plots and confidence intervals are needed because Taxi learning is seed-sensitive.</w:t>
+      </w:r>
+    </w:p>
+    <w:p>
+      <w:pPr>
+        <w:pStyle w:val="Heading1"/>
+      </w:pPr>
+      <w:r>
+        <w:t>9. Results and Deep Interpretation</w:t>
+      </w:r>
+    </w:p>
+    <w:p>
+      <w:pPr>
+        <w:pStyle w:val="Heading2"/>
+      </w:pPr>
+      <w:r>
+        <w:t>9.1 Component Ablation</w:t>
+      </w:r>
+    </w:p>
+    <w:p>
+      <w:r>
+        <w:t>The ablation compares the contribution of prioritized sweeping and kernel generalization under the base reward.</w:t>
       </w:r>
     </w:p>
     <w:p>
@@ -1264,7 +1374,7 @@
               <a:graphicData uri="http://schemas.openxmlformats.org/drawingml/2006/picture">
                 <pic:pic>
                   <pic:nvPicPr>
-                    <pic:cNvPr id="0" name="ablation_base_success.png"/>
+                    <pic:cNvPr id="0" name="ablation_base_env_reward.png"/>
                     <pic:cNvPicPr/>
                   </pic:nvPicPr>
                   <pic:blipFill>
@@ -1292,78 +1402,7 @@
         <w:pStyle w:val="Caption"/>
       </w:pPr>
       <w:r>
-        <w:t>Figure: Ablation base success rate</w:t>
-      </w:r>
-    </w:p>
-    <w:p>
-      <w:r>
-        <w:t>In the final 50-episode tail, all four base-reward setups reached 100% success in the current results. The final mean environment reward was approximately:</w:t>
-      </w:r>
-    </w:p>
-    <w:p>
-      <w:pPr>
-        <w:pStyle w:val="CodeBlock"/>
-      </w:pPr>
-      <w:r>
-        <w:rPr>
-          <w:rFonts w:ascii="Courier New" w:hAnsi="Courier New"/>
-          <w:sz w:val="18"/>
-        </w:rPr>
-        <w:t>Pure SARSA:          4.98</w:t>
-      </w:r>
-    </w:p>
-    <w:p>
-      <w:pPr>
-        <w:pStyle w:val="CodeBlock"/>
-      </w:pPr>
-      <w:r>
-        <w:rPr>
-          <w:rFonts w:ascii="Courier New" w:hAnsi="Courier New"/>
-          <w:sz w:val="18"/>
-        </w:rPr>
-        <w:t>SARSA + Planning:    2.73</w:t>
-      </w:r>
-    </w:p>
-    <w:p>
-      <w:pPr>
-        <w:pStyle w:val="CodeBlock"/>
-      </w:pPr>
-      <w:r>
-        <w:rPr>
-          <w:rFonts w:ascii="Courier New" w:hAnsi="Courier New"/>
-          <w:sz w:val="18"/>
-        </w:rPr>
-        <w:t>SARSA + Kernel:      6.66</w:t>
-      </w:r>
-    </w:p>
-    <w:p>
-      <w:pPr>
-        <w:pStyle w:val="CodeBlock"/>
-      </w:pPr>
-      <w:r>
-        <w:rPr>
-          <w:rFonts w:ascii="Courier New" w:hAnsi="Courier New"/>
-          <w:sz w:val="18"/>
-        </w:rPr>
-        <w:t>Full Framework:      5.92</w:t>
-      </w:r>
-    </w:p>
-    <w:p>
-      <w:r>
-        <w:t>The kernel-only setup was strongest in final environment reward. This makes sense in deterministic Taxi because nearby states with the same passenger status and destination often share similar movement values. Planning alone was weaker in the final score, likely because replay can amplify early imperfect values and because the fixed planning depth may not be optimal for every phase of learning. The full framework still performs well, but its extra mechanisms increase sensitivity to hyperparameters.</w:t>
-      </w:r>
-    </w:p>
-    <w:p>
-      <w:pPr>
-        <w:pStyle w:val="Heading2"/>
-      </w:pPr>
-      <w:r>
-        <w:t>9.2 Reward Comparison</w:t>
-      </w:r>
-    </w:p>
-    <w:p>
-      <w:r>
-        <w:t>The reward comparison uses the full framework for all reward designs. Since internal training rewards have different scales, the main environment reward plot is normalized.</w:t>
+        <w:t>Figure: Ablation base environment reward</w:t>
       </w:r>
     </w:p>
     <w:p>
@@ -1382,7 +1421,7 @@
               <a:graphicData uri="http://schemas.openxmlformats.org/drawingml/2006/picture">
                 <pic:pic>
                   <pic:nvPicPr>
-                    <pic:cNvPr id="0" name="reward_comparison_env_reward.png"/>
+                    <pic:cNvPr id="0" name="ablation_base_success.png"/>
                     <pic:cNvPicPr/>
                   </pic:nvPicPr>
                   <pic:blipFill>
@@ -1410,7 +1449,78 @@
         <w:pStyle w:val="Caption"/>
       </w:pPr>
       <w:r>
-        <w:t>Figure: Reward comparison normalized environment reward</w:t>
+        <w:t>Figure: Ablation base success rate</w:t>
+      </w:r>
+    </w:p>
+    <w:p>
+      <w:r>
+        <w:t>In the final 50-episode tail, all four base-reward setups reached 100% success in the current results. The final mean environment reward was approximately:</w:t>
+      </w:r>
+    </w:p>
+    <w:p>
+      <w:pPr>
+        <w:pStyle w:val="CodeBlock"/>
+      </w:pPr>
+      <w:r>
+        <w:rPr>
+          <w:rFonts w:ascii="Courier New" w:hAnsi="Courier New"/>
+          <w:sz w:val="18"/>
+        </w:rPr>
+        <w:t>Pure SARSA:          4.98</w:t>
+      </w:r>
+    </w:p>
+    <w:p>
+      <w:pPr>
+        <w:pStyle w:val="CodeBlock"/>
+      </w:pPr>
+      <w:r>
+        <w:rPr>
+          <w:rFonts w:ascii="Courier New" w:hAnsi="Courier New"/>
+          <w:sz w:val="18"/>
+        </w:rPr>
+        <w:t>SARSA + Planning:    2.73</w:t>
+      </w:r>
+    </w:p>
+    <w:p>
+      <w:pPr>
+        <w:pStyle w:val="CodeBlock"/>
+      </w:pPr>
+      <w:r>
+        <w:rPr>
+          <w:rFonts w:ascii="Courier New" w:hAnsi="Courier New"/>
+          <w:sz w:val="18"/>
+        </w:rPr>
+        <w:t>SARSA + Kernel:      6.66</w:t>
+      </w:r>
+    </w:p>
+    <w:p>
+      <w:pPr>
+        <w:pStyle w:val="CodeBlock"/>
+      </w:pPr>
+      <w:r>
+        <w:rPr>
+          <w:rFonts w:ascii="Courier New" w:hAnsi="Courier New"/>
+          <w:sz w:val="18"/>
+        </w:rPr>
+        <w:t>Full Framework:      5.92</w:t>
+      </w:r>
+    </w:p>
+    <w:p>
+      <w:r>
+        <w:t>The kernel-only setup was strongest in final environment reward. This makes sense in deterministic Taxi because nearby states with the same passenger status and destination often share similar movement values. Planning alone was weaker in the final score, likely because replay can amplify early imperfect values and because the fixed planning depth may not be optimal for every phase of learning. The full framework still performs well, but its extra mechanisms increase sensitivity to hyperparameters.</w:t>
+      </w:r>
+    </w:p>
+    <w:p>
+      <w:pPr>
+        <w:pStyle w:val="Heading2"/>
+      </w:pPr>
+      <w:r>
+        <w:t>9.2 Reward Comparison</w:t>
+      </w:r>
+    </w:p>
+    <w:p>
+      <w:r>
+        <w:t>The reward comparison uses the full framework for all reward designs. Since internal training rewards have different scales, the main environment reward plot is normalized.</w:t>
       </w:r>
     </w:p>
     <w:p>
@@ -1429,7 +1539,7 @@
               <a:graphicData uri="http://schemas.openxmlformats.org/drawingml/2006/picture">
                 <pic:pic>
                   <pic:nvPicPr>
-                    <pic:cNvPr id="0" name="reward_comparison_success.png"/>
+                    <pic:cNvPr id="0" name="reward_comparison_env_reward.png"/>
                     <pic:cNvPicPr/>
                   </pic:nvPicPr>
                   <pic:blipFill>
@@ -1457,6 +1567,53 @@
         <w:pStyle w:val="Caption"/>
       </w:pPr>
       <w:r>
+        <w:t>Figure: Reward comparison normalized environment reward</w:t>
+      </w:r>
+    </w:p>
+    <w:p>
+      <w:pPr>
+        <w:jc w:val="center"/>
+      </w:pPr>
+      <w:r>
+        <w:drawing>
+          <wp:inline xmlns:a="http://schemas.openxmlformats.org/drawingml/2006/main" xmlns:pic="http://schemas.openxmlformats.org/drawingml/2006/picture">
+            <wp:extent cx="5943600" cy="3241964"/>
+            <wp:docPr id="5" name="Picture 5"/>
+            <wp:cNvGraphicFramePr>
+              <a:graphicFrameLocks noChangeAspect="1"/>
+            </wp:cNvGraphicFramePr>
+            <a:graphic>
+              <a:graphicData uri="http://schemas.openxmlformats.org/drawingml/2006/picture">
+                <pic:pic>
+                  <pic:nvPicPr>
+                    <pic:cNvPr id="0" name="reward_comparison_success.png"/>
+                    <pic:cNvPicPr/>
+                  </pic:nvPicPr>
+                  <pic:blipFill>
+                    <a:blip r:embed="rId13"/>
+                    <a:stretch>
+                      <a:fillRect/>
+                    </a:stretch>
+                  </pic:blipFill>
+                  <pic:spPr>
+                    <a:xfrm>
+                      <a:off x="0" y="0"/>
+                      <a:ext cx="5943600" cy="3241964"/>
+                    </a:xfrm>
+                    <a:prstGeom prst="rect"/>
+                  </pic:spPr>
+                </pic:pic>
+              </a:graphicData>
+            </a:graphic>
+          </wp:inline>
+        </w:drawing>
+      </w:r>
+    </w:p>
+    <w:p>
+      <w:pPr>
+        <w:pStyle w:val="Caption"/>
+      </w:pPr>
+      <w:r>
         <w:t>Figure: Reward comparison success rate</w:t>
       </w:r>
     </w:p>
@@ -1551,7 +1708,7 @@
         <w:drawing>
           <wp:inline xmlns:a="http://schemas.openxmlformats.org/drawingml/2006/main" xmlns:pic="http://schemas.openxmlformats.org/drawingml/2006/picture">
             <wp:extent cx="5943600" cy="4245429"/>
-            <wp:docPr id="5" name="Picture 5"/>
+            <wp:docPr id="6" name="Picture 6"/>
             <wp:cNvGraphicFramePr>
               <a:graphicFrameLocks noChangeAspect="1"/>
             </wp:cNvGraphicFramePr>
@@ -1563,7 +1720,7 @@
                     <pic:cNvPicPr/>
                   </pic:nvPicPr>
                   <pic:blipFill>
-                    <a:blip r:embed="rId13"/>
+                    <a:blip r:embed="rId14"/>
                     <a:stretch>
                       <a:fillRect/>
                     </a:stretch>
@@ -1598,7 +1755,7 @@
         <w:drawing>
           <wp:inline xmlns:a="http://schemas.openxmlformats.org/drawingml/2006/main" xmlns:pic="http://schemas.openxmlformats.org/drawingml/2006/picture">
             <wp:extent cx="5943600" cy="4245429"/>
-            <wp:docPr id="6" name="Picture 6"/>
+            <wp:docPr id="7" name="Picture 7"/>
             <wp:cNvGraphicFramePr>
               <a:graphicFrameLocks noChangeAspect="1"/>
             </wp:cNvGraphicFramePr>
@@ -1610,7 +1767,7 @@
                     <pic:cNvPicPr/>
                   </pic:nvPicPr>
                   <pic:blipFill>
-                    <a:blip r:embed="rId14"/>
+                    <a:blip r:embed="rId15"/>
                     <a:stretch>
                       <a:fillRect/>
                     </a:stretch>

</xml_diff>